<commit_message>
Refine the AI effectiveness paper: tighten, temper and promote the framework
Moves the framework to section 2 so the paper reads as testing it; recasts the
binding constraint, lessons cycle, training contribution and institutional
barrier as working judgements; reframes the four competence requirements as
complementary rather than cumulative; replaces the multiplicative autonomy rule
with an assurance test; combines the training subparagraphs from seven to five;
reduces the principles from seven to five; and removes reasoning duplicated
between the answer, the principles and the conclusion. Six pages to five.

Co-Authored-By: Claude Opus 5 <noreply@anthropic.com>
Claude-Session: https://claude.ai/code/session_014ebTbQdLKZmAdeXWfR1Dsj
</commit_message>
<xml_diff>
--- a/output/ai-army-operational-effectiveness.docx
+++ b/output/ai-army-operational-effectiveness.docx
@@ -335,7 +335,7 @@
           <w:b w:val="false"/>
           <w:i w:val="false"/>
         </w:rPr>
-        <w:t>This paper reasons from Army's outputs backwards to the technology. It does not begin from the assumption that Army must adopt AI, and it does not catalogue uses. It asks where AI could materially improve Army's ability to generate and employ land capability, what must remain human, and what that means for Army's people and their training.</w:t>
+        <w:t>This paper reasons from Army's outputs backwards to the technology. It does not assume Army must adopt AI, and it does not catalogue uses. It asks where AI could materially improve Army's ability to generate and employ land capability, what must remain human, and what that means for Army's people.</w:t>
       </w:r>
     </w:p>
     <w:p>
@@ -362,7 +362,7 @@
           <w:b w:val="false"/>
           <w:i w:val="false"/>
         </w:rPr>
-        <w:t>AI is new within the NZDF. Access is limited to basic tools on constrained networks, and the evidence for military effect is thin and drawn largely from larger armies with different problems. Where this paper asserts, the assertion rests on reasoning from Army's own situation. Where the evidence is insufficient, it says so.</w:t>
+        <w:t>AI is new within the NZDF. Access is limited to basic tools on constrained networks, and the evidence for military effect is thin and drawn largely from larger armies with different problems. Several of the propositions below are working judgements reasoned from Army's situation rather than findings, and are marked as such. They are offered to be tested, not accepted.</w:t>
       </w:r>
     </w:p>
     <w:p>
@@ -408,7 +408,7 @@
           <w:b w:val="false"/>
           <w:i w:val="false"/>
         </w:rPr>
-        <w:t>Army exists to generate land forces ready for operations, to employ them, and to learn from doing both. Almost everything else Army does supports those three outputs.</w:t>
+        <w:t>Army exists to generate land forces ready for operations, to employ them, and to learn from doing both. Almost everything else supports those three outputs.</w:t>
       </w:r>
     </w:p>
     <w:p>
@@ -435,7 +435,7 @@
           <w:b w:val="false"/>
           <w:i w:val="false"/>
         </w:rPr>
-        <w:t>For a small army the binding constraint on all three is skilled human capacity. There are not enough experienced people, and those there are spend a large share of their time on staff and administrative work that consumes judgement without exercising it. Depth is thin, and adaptation is slow because the people who must adapt are the people already fully committed.</w:t>
+        <w:t>The working judgement of this paper is that for a small army the constraint limiting all three is skilled human capacity. There are not enough experienced people; much of their time goes on staff work that consumes judgement without exercising it; depth is thin; and adaptation is slow because those who must adapt are already fully committed. If that judgement is wrong, the priorities below change.</w:t>
       </w:r>
     </w:p>
     <w:p>
@@ -462,7 +462,7 @@
           <w:b w:val="false"/>
           <w:i w:val="false"/>
         </w:rPr>
-        <w:t>AI increases operational effectiveness where it relieves that constraint in ways that convert into capability: faster and better planning; clearer understanding of the force and its environment; more adaptive generation of trained people; faster institutional learning; and the return of experienced people's time to judgement, leadership and training. It does not increase effectiveness where it lets administration be done faster and the hours are absorbed by more administration.</w:t>
+        <w:t>It follows that AI increases operational effectiveness where it relieves that constraint in ways that convert into capability, and not otherwise.</w:t>
       </w:r>
     </w:p>
     <w:p>
@@ -484,7 +484,7 @@
           <w:color w:val="00261B"/>
           <w:sz w:val="20"/>
         </w:rPr>
-        <w:t>Army should use AI to see itself and its environment more clearly, decide faster with better options, generate and adapt trained people more quickly, and learn from experience at a pace the force can act on, while remaining able to fight when the tools are denied.</w:t>
+        <w:t>Army should use AI where it relieves the constraint on skilled human capacity in ways that convert into capability.</w:t>
       </w:r>
     </w:p>
     <w:p>
@@ -511,7 +511,7 @@
           <w:b w:val="false"/>
           <w:i w:val="false"/>
         </w:rPr>
-        <w:t xml:space="preserve">Three distinctions organise what follows. </w:t>
+        <w:t xml:space="preserve">Three distinctions govern everything that follows. </w:t>
       </w:r>
       <w:r>
         <w:rPr>
@@ -527,7 +527,7 @@
           <w:b w:val="false"/>
           <w:i w:val="false"/>
         </w:rPr>
-        <w:t xml:space="preserve"> changes what Army can do on operations or how fast it can generate capability. </w:t>
+        <w:t xml:space="preserve"> changes what Army can do on operations, or how fast it can generate capability. </w:t>
       </w:r>
       <w:r>
         <w:rPr>
@@ -543,7 +543,7 @@
           <w:b w:val="false"/>
           <w:i w:val="false"/>
         </w:rPr>
-        <w:t xml:space="preserve"> frees time, and becomes advantage only if leaders redirect the time. </w:t>
+        <w:t xml:space="preserve"> frees time, and becomes advantage only when leaders redirect the time. </w:t>
       </w:r>
       <w:r>
         <w:rPr>
@@ -578,7 +578,7 @@
           <w:color w:val="000000"/>
           <w:sz w:val="23"/>
         </w:rPr>
-        <w:t>2. Where AI Creates Military Advantage</w:t>
+        <w:t>2. The Framework</w:t>
       </w:r>
     </w:p>
     <w:p>
@@ -605,7 +605,406 @@
           <w:b w:val="false"/>
           <w:i w:val="false"/>
         </w:rPr>
-        <w:t>Five areas pass the test. They are ordered by the strength of the mechanism and by how much of the opportunity Army itself controls.</w:t>
+        <w:t>One framework organises this paper and tests any proposed application. It reasons from the output to the tool, and closes on measured effect.</w:t>
+      </w:r>
+    </w:p>
+    <w:p>
+      <w:pPr>
+        <w:pStyle w:val="Normal"/>
+        <w:shd w:val="clear" w:color="auto" w:fill="00261B"/>
+        <w:spacing w:before="80" w:after="100"/>
+        <w:jc w:val="center"/>
+        <w:rPr/>
+      </w:pPr>
+      <w:r>
+        <w:rPr>
+          <w:rFonts w:cs="Calibri"/>
+          <w:b/>
+          <w:i w:val="false"/>
+          <w:color w:val="FFFFFF"/>
+          <w:sz w:val="18"/>
+        </w:rPr>
+        <w:t>Output → Task → Constraint → AI Mechanism → Human Role → Consequence and Assurance → Competence and Practice → Effect</w:t>
+      </w:r>
+    </w:p>
+    <w:p>
+      <w:pPr>
+        <w:pStyle w:val="Normal"/>
+        <w:tabs>
+          <w:tab w:val="clear" w:pos="720"/>
+          <w:tab w:val="left" w:pos="510" w:leader="none"/>
+        </w:tabs>
+        <w:spacing w:before="0" w:after="100"/>
+        <w:ind w:hanging="510" w:left="510"/>
+        <w:rPr/>
+      </w:pPr>
+      <w:r>
+        <w:rPr>
+          <w:rFonts w:cs="Calibri"/>
+        </w:rPr>
+        <w:t>8.</w:t>
+        <w:tab/>
+      </w:r>
+      <w:r>
+        <w:rPr>
+          <w:rFonts w:cs="Calibri"/>
+          <w:b w:val="false"/>
+          <w:i w:val="false"/>
+        </w:rPr>
+        <w:t>In use:</w:t>
+      </w:r>
+    </w:p>
+    <w:p>
+      <w:pPr>
+        <w:pStyle w:val="Normal"/>
+        <w:tabs>
+          <w:tab w:val="clear" w:pos="720"/>
+          <w:tab w:val="left" w:pos="1020" w:leader="none"/>
+        </w:tabs>
+        <w:spacing w:before="0" w:after="100"/>
+        <w:ind w:hanging="510" w:left="1020"/>
+        <w:rPr/>
+      </w:pPr>
+      <w:r>
+        <w:rPr>
+          <w:rFonts w:cs="Calibri"/>
+        </w:rPr>
+        <w:t>a.</w:t>
+        <w:tab/>
+      </w:r>
+      <w:r>
+        <w:rPr>
+          <w:rFonts w:cs="Calibri"/>
+          <w:b/>
+          <w:i w:val="false"/>
+        </w:rPr>
+        <w:t>Output.</w:t>
+      </w:r>
+      <w:r>
+        <w:rPr>
+          <w:rFonts w:cs="Calibri"/>
+          <w:b w:val="false"/>
+          <w:i w:val="false"/>
+        </w:rPr>
+        <w:t xml:space="preserve"> What must Army deliver, and to what standard?</w:t>
+      </w:r>
+    </w:p>
+    <w:p>
+      <w:pPr>
+        <w:pStyle w:val="Normal"/>
+        <w:tabs>
+          <w:tab w:val="clear" w:pos="720"/>
+          <w:tab w:val="left" w:pos="1020" w:leader="none"/>
+        </w:tabs>
+        <w:spacing w:before="0" w:after="100"/>
+        <w:ind w:hanging="510" w:left="1020"/>
+        <w:rPr/>
+      </w:pPr>
+      <w:r>
+        <w:rPr>
+          <w:rFonts w:cs="Calibri"/>
+        </w:rPr>
+        <w:t>b.</w:t>
+        <w:tab/>
+      </w:r>
+      <w:r>
+        <w:rPr>
+          <w:rFonts w:cs="Calibri"/>
+          <w:b/>
+          <w:i w:val="false"/>
+        </w:rPr>
+        <w:t>Task.</w:t>
+      </w:r>
+      <w:r>
+        <w:rPr>
+          <w:rFonts w:cs="Calibri"/>
+          <w:b w:val="false"/>
+          <w:i w:val="false"/>
+        </w:rPr>
+        <w:t xml:space="preserve"> Which task limits that output?</w:t>
+      </w:r>
+    </w:p>
+    <w:p>
+      <w:pPr>
+        <w:pStyle w:val="Normal"/>
+        <w:tabs>
+          <w:tab w:val="clear" w:pos="720"/>
+          <w:tab w:val="left" w:pos="1020" w:leader="none"/>
+        </w:tabs>
+        <w:spacing w:before="0" w:after="100"/>
+        <w:ind w:hanging="510" w:left="1020"/>
+        <w:rPr/>
+      </w:pPr>
+      <w:r>
+        <w:rPr>
+          <w:rFonts w:cs="Calibri"/>
+        </w:rPr>
+        <w:t>c.</w:t>
+        <w:tab/>
+      </w:r>
+      <w:r>
+        <w:rPr>
+          <w:rFonts w:cs="Calibri"/>
+          <w:b/>
+          <w:i w:val="false"/>
+        </w:rPr>
+        <w:t>Constraint.</w:t>
+      </w:r>
+      <w:r>
+        <w:rPr>
+          <w:rFonts w:cs="Calibri"/>
+          <w:b w:val="false"/>
+          <w:i w:val="false"/>
+        </w:rPr>
+        <w:t xml:space="preserve"> What limits the task: time, quality, scale, understanding or people?</w:t>
+      </w:r>
+    </w:p>
+    <w:p>
+      <w:pPr>
+        <w:pStyle w:val="Normal"/>
+        <w:tabs>
+          <w:tab w:val="clear" w:pos="720"/>
+          <w:tab w:val="left" w:pos="1020" w:leader="none"/>
+        </w:tabs>
+        <w:spacing w:before="0" w:after="100"/>
+        <w:ind w:hanging="510" w:left="1020"/>
+        <w:rPr/>
+      </w:pPr>
+      <w:r>
+        <w:rPr>
+          <w:rFonts w:cs="Calibri"/>
+        </w:rPr>
+        <w:t>d.</w:t>
+        <w:tab/>
+      </w:r>
+      <w:r>
+        <w:rPr>
+          <w:rFonts w:cs="Calibri"/>
+          <w:b/>
+          <w:i w:val="false"/>
+        </w:rPr>
+        <w:t>AI mechanism.</w:t>
+      </w:r>
+      <w:r>
+        <w:rPr>
+          <w:rFonts w:cs="Calibri"/>
+          <w:b w:val="false"/>
+          <w:i w:val="false"/>
+        </w:rPr>
+        <w:t xml:space="preserve"> Would AI relieve that constraint, and how? If the mechanism cannot be stated plainly, stop.</w:t>
+      </w:r>
+    </w:p>
+    <w:p>
+      <w:pPr>
+        <w:pStyle w:val="Normal"/>
+        <w:tabs>
+          <w:tab w:val="clear" w:pos="720"/>
+          <w:tab w:val="left" w:pos="1020" w:leader="none"/>
+        </w:tabs>
+        <w:spacing w:before="0" w:after="100"/>
+        <w:ind w:hanging="510" w:left="1020"/>
+        <w:rPr/>
+      </w:pPr>
+      <w:r>
+        <w:rPr>
+          <w:rFonts w:cs="Calibri"/>
+        </w:rPr>
+        <w:t>e.</w:t>
+        <w:tab/>
+      </w:r>
+      <w:r>
+        <w:rPr>
+          <w:rFonts w:cs="Calibri"/>
+          <w:b/>
+          <w:i w:val="false"/>
+        </w:rPr>
+        <w:t>Human role.</w:t>
+      </w:r>
+      <w:r>
+        <w:rPr>
+          <w:rFonts w:cs="Calibri"/>
+          <w:b w:val="false"/>
+          <w:i w:val="false"/>
+        </w:rPr>
+        <w:t xml:space="preserve"> Augment, automate or enable, and what stays with the person.</w:t>
+      </w:r>
+    </w:p>
+    <w:p>
+      <w:pPr>
+        <w:pStyle w:val="Normal"/>
+        <w:tabs>
+          <w:tab w:val="clear" w:pos="720"/>
+          <w:tab w:val="left" w:pos="1020" w:leader="none"/>
+        </w:tabs>
+        <w:spacing w:before="0" w:after="100"/>
+        <w:ind w:hanging="510" w:left="1020"/>
+        <w:rPr/>
+      </w:pPr>
+      <w:r>
+        <w:rPr>
+          <w:rFonts w:cs="Calibri"/>
+        </w:rPr>
+        <w:t>f.</w:t>
+        <w:tab/>
+      </w:r>
+      <w:r>
+        <w:rPr>
+          <w:rFonts w:cs="Calibri"/>
+          <w:b/>
+          <w:i w:val="false"/>
+        </w:rPr>
+        <w:t>Consequence and assurance.</w:t>
+      </w:r>
+      <w:r>
+        <w:rPr>
+          <w:rFonts w:cs="Calibri"/>
+          <w:b w:val="false"/>
+          <w:i w:val="false"/>
+        </w:rPr>
+        <w:t xml:space="preserve"> What does the consequence of error require by way of control and verification?</w:t>
+      </w:r>
+    </w:p>
+    <w:p>
+      <w:pPr>
+        <w:pStyle w:val="Normal"/>
+        <w:tabs>
+          <w:tab w:val="clear" w:pos="720"/>
+          <w:tab w:val="left" w:pos="1020" w:leader="none"/>
+        </w:tabs>
+        <w:spacing w:before="0" w:after="100"/>
+        <w:ind w:hanging="510" w:left="1020"/>
+        <w:rPr/>
+      </w:pPr>
+      <w:r>
+        <w:rPr>
+          <w:rFonts w:cs="Calibri"/>
+        </w:rPr>
+        <w:t>g.</w:t>
+        <w:tab/>
+      </w:r>
+      <w:r>
+        <w:rPr>
+          <w:rFonts w:cs="Calibri"/>
+          <w:b/>
+          <w:i w:val="false"/>
+        </w:rPr>
+        <w:t>Competence and practice.</w:t>
+      </w:r>
+      <w:r>
+        <w:rPr>
+          <w:rFonts w:cs="Calibri"/>
+          <w:b w:val="false"/>
+          <w:i w:val="false"/>
+        </w:rPr>
+        <w:t xml:space="preserve"> Who must be able to do what, and how will they practise it?</w:t>
+      </w:r>
+    </w:p>
+    <w:p>
+      <w:pPr>
+        <w:pStyle w:val="Normal"/>
+        <w:tabs>
+          <w:tab w:val="clear" w:pos="720"/>
+          <w:tab w:val="left" w:pos="1020" w:leader="none"/>
+        </w:tabs>
+        <w:spacing w:before="0" w:after="100"/>
+        <w:ind w:hanging="510" w:left="1020"/>
+        <w:rPr/>
+      </w:pPr>
+      <w:r>
+        <w:rPr>
+          <w:rFonts w:cs="Calibri"/>
+        </w:rPr>
+        <w:t>h.</w:t>
+        <w:tab/>
+      </w:r>
+      <w:r>
+        <w:rPr>
+          <w:rFonts w:cs="Calibri"/>
+          <w:b/>
+          <w:i w:val="false"/>
+        </w:rPr>
+        <w:t>Effect.</w:t>
+      </w:r>
+      <w:r>
+        <w:rPr>
+          <w:rFonts w:cs="Calibri"/>
+          <w:b w:val="false"/>
+          <w:i w:val="false"/>
+        </w:rPr>
+        <w:t xml:space="preserve"> Measure the effect on the output, not the use of the tool. Scale, adjust or stop.</w:t>
+      </w:r>
+    </w:p>
+    <w:p>
+      <w:pPr>
+        <w:pStyle w:val="Normal"/>
+        <w:tabs>
+          <w:tab w:val="clear" w:pos="720"/>
+          <w:tab w:val="left" w:pos="510" w:leader="none"/>
+        </w:tabs>
+        <w:spacing w:before="0" w:after="100"/>
+        <w:ind w:hanging="510" w:left="510"/>
+        <w:rPr/>
+      </w:pPr>
+      <w:r>
+        <w:rPr>
+          <w:rFonts w:cs="Calibri"/>
+        </w:rPr>
+        <w:t>9.</w:t>
+        <w:tab/>
+      </w:r>
+      <w:r>
+        <w:rPr>
+          <w:rFonts w:cs="Calibri"/>
+          <w:b w:val="false"/>
+          <w:i w:val="false"/>
+        </w:rPr>
+        <w:t>A commander, staff officer or training lead should run this on a single page. An application that cannot answer steps c and d is novelty. The sections that follow apply it.</w:t>
+      </w:r>
+    </w:p>
+    <w:p>
+      <w:pPr>
+        <w:pStyle w:val="Heading1"/>
+        <w:pBdr>
+          <w:top w:val="single" w:sz="12" w:space="6" w:color="000000"/>
+        </w:pBdr>
+        <w:rPr/>
+      </w:pPr>
+      <w:r>
+        <w:rPr>
+          <w:rFonts w:cs="Arial Black" w:ascii="Arial Black" w:hAnsi="Arial Black"/>
+          <w:b w:val="false"/>
+          <w:i w:val="false"/>
+          <w:color w:val="000000"/>
+          <w:sz w:val="23"/>
+        </w:rPr>
+        <w:t>3. Where AI Creates Military Advantage</w:t>
+      </w:r>
+    </w:p>
+    <w:p>
+      <w:pPr>
+        <w:pStyle w:val="Normal"/>
+        <w:tabs>
+          <w:tab w:val="clear" w:pos="720"/>
+          <w:tab w:val="left" w:pos="510" w:leader="none"/>
+        </w:tabs>
+        <w:spacing w:before="0" w:after="100"/>
+        <w:ind w:hanging="510" w:left="510"/>
+        <w:rPr/>
+      </w:pPr>
+      <w:r>
+        <w:rPr>
+          <w:rFonts w:cs="Calibri"/>
+        </w:rPr>
+        <w:t>10.</w:t>
+        <w:tab/>
+      </w:r>
+      <w:r>
+        <w:rPr>
+          <w:rFonts w:cs="Calibri"/>
+          <w:b w:val="false"/>
+          <w:i w:val="false"/>
+        </w:rPr>
+        <w:t>Five areas survive the test, ordered by the strength of the mechanism and by how much of the opportunity Army itself controls.</w:t>
       </w:r>
     </w:p>
     <w:p>
@@ -639,16 +1038,16 @@
         <w:rPr>
           <w:rFonts w:cs="Calibri"/>
         </w:rPr>
-        <w:t>8.</w:t>
-        <w:tab/>
-      </w:r>
-      <w:r>
-        <w:rPr>
-          <w:rFonts w:cs="Calibri"/>
-          <w:b w:val="false"/>
-          <w:i w:val="false"/>
-        </w:rPr>
-        <w:t>The appreciation, course of action development, orders production and the routine staff estimate are language and structure tasks that consume the scarcest people in a headquarters. AI can generate and stress-test options, draft and check products against intent and format, and surface omissions. The mechanism is speed and breadth of option generation, and staff time returned to judgement. The mode is augment: the decision, the acceptance of risk and the intent remain the commander's. The risk is a plausible product that is wrong in a detail no one checks, and a staff that loses the ability to run the process unaided.</w:t>
+        <w:t>11.</w:t>
+        <w:tab/>
+      </w:r>
+      <w:r>
+        <w:rPr>
+          <w:rFonts w:cs="Calibri"/>
+          <w:b w:val="false"/>
+          <w:i w:val="false"/>
+        </w:rPr>
+        <w:t>The appreciation, course of action development, orders production and the routine staff estimate are language and structure tasks consuming the scarcest people in a headquarters. AI can generate and stress-test options, draft and check products against intent and format, and surface omissions, returning staff time to judgement. The decision, the acceptance of risk and the intent remain the commander's. The risk is a plausible product wrong in a detail no one checks, and a staff that loses the ability to run the process unaided.</w:t>
       </w:r>
     </w:p>
     <w:p>
@@ -682,16 +1081,16 @@
         <w:rPr>
           <w:rFonts w:cs="Calibri"/>
         </w:rPr>
-        <w:t>9.</w:t>
-        <w:tab/>
-      </w:r>
-      <w:r>
-        <w:rPr>
-          <w:rFonts w:cs="Calibri"/>
-          <w:b w:val="false"/>
-          <w:i w:val="false"/>
-        </w:rPr>
-        <w:t>A small intelligence cell cannot process the open-source, coalition and sensor information now available to it. AI can fuse, summarise, translate and flag change across volumes a person cannot read. Separately, Army's own readiness data on people, training, equipment and health sits in disconnected systems and spreadsheets, and commanders see it late and in part. The mechanism is scale and decision advantage: understanding sooner, from more. For intelligence the mode is augment, and much of the opportunity is enabled by allies; Army's advantage lies in competent consumption and contribution, not in building the system. For readiness the mode is enable, because Army cannot currently do this at all, and the limit is data quality rather than technology.</w:t>
+        <w:t>12.</w:t>
+        <w:tab/>
+      </w:r>
+      <w:r>
+        <w:rPr>
+          <w:rFonts w:cs="Calibri"/>
+          <w:b w:val="false"/>
+          <w:i w:val="false"/>
+        </w:rPr>
+        <w:t>A small intelligence cell cannot process the open-source, coalition and sensor information available to it. AI can fuse, summarise, translate and flag change across volumes a person cannot read. Much of that opportunity is enabled by allies; Army's advantage lies in competent consumption and contribution, not in building the system. Separately, Army's readiness data on people, training, equipment and health sits in disconnected systems, and commanders see it late and in part. Army cannot currently see itself whole at all, and the constraint on doing so is data quality rather than technology.</w:t>
       </w:r>
     </w:p>
     <w:p>
@@ -725,16 +1124,16 @@
         <w:rPr>
           <w:rFonts w:cs="Calibri"/>
         </w:rPr>
-        <w:t>10.</w:t>
-        <w:tab/>
-      </w:r>
-      <w:r>
-        <w:rPr>
-          <w:rFonts w:cs="Calibri"/>
-          <w:b w:val="false"/>
-          <w:i w:val="false"/>
-        </w:rPr>
-        <w:t>Training design, content maintenance, scenario and simulation generation, individual practice, feedback and assessment support are the heart of force generation and the point where the training approach and AI meet. AI can make adaptive pathways practical at scale, keep content current as tactics and equipment change, and shift instructor effort from transmission to coaching. The mechanism is readiness, through faster and more adaptive generation of competence. The mode is augment and enable. Section 5 develops this.</w:t>
+        <w:t>13.</w:t>
+        <w:tab/>
+      </w:r>
+      <w:r>
+        <w:rPr>
+          <w:rFonts w:cs="Calibri"/>
+          <w:b w:val="false"/>
+          <w:i w:val="false"/>
+        </w:rPr>
+        <w:t>Training design, content maintenance, scenario and simulation generation, individual practice, feedback and assessment support are the heart of force generation, and the point where the training approach and AI meet. AI can make adaptive pathways practical at scale, keep content current as tactics and equipment change, and shift instructor effort from transmission to coaching. The gain is readiness, through faster and more adaptive generation of competence. Section 6 develops this.</w:t>
       </w:r>
     </w:p>
     <w:p>
@@ -768,16 +1167,16 @@
         <w:rPr>
           <w:rFonts w:cs="Calibri"/>
         </w:rPr>
-        <w:t>11.</w:t>
-        <w:tab/>
-      </w:r>
-      <w:r>
-        <w:rPr>
-          <w:rFonts w:cs="Calibri"/>
-          <w:b w:val="false"/>
-          <w:i w:val="false"/>
-        </w:rPr>
-        <w:t>Army's lessons cycle runs on documents and committees, and is slower than the tempo at which threats, tactics and equipment change. AI can compress the path from observation, after-action review and report to updated training content and doctrine. The mechanism is institutional learning speed, which for a small army is survival, because it cannot afford to relearn. The mode is enable. The uncertainty is whether the organisation will act at the speed the tool allows.</w:t>
+        <w:t>14.</w:t>
+        <w:tab/>
+      </w:r>
+      <w:r>
+        <w:rPr>
+          <w:rFonts w:cs="Calibri"/>
+          <w:b w:val="false"/>
+          <w:i w:val="false"/>
+        </w:rPr>
+        <w:t>Army's lessons cycle runs on documents and committees. The working judgement here is that it is slower than the tempo at which threats, tactics and equipment now change; Army should test this against its actual cycle times before acting on it. If it holds, AI can compress the path from observation and after-action review to updated training content and doctrine. Institutional learning speed matters for a small army because it cannot afford to relearn. The uncertainty is whether the organisation will act at the speed the tool allows.</w:t>
       </w:r>
     </w:p>
     <w:p>
@@ -811,16 +1210,16 @@
         <w:rPr>
           <w:rFonts w:cs="Calibri"/>
         </w:rPr>
-        <w:t>12.</w:t>
-        <w:tab/>
-      </w:r>
-      <w:r>
-        <w:rPr>
-          <w:rFonts w:cs="Calibri"/>
-          <w:b w:val="false"/>
-          <w:i w:val="false"/>
-        </w:rPr>
-        <w:t>Correspondence, reporting, returns, minutes, records and routine staff process will yield the largest and earliest gains in hours. The mechanism is human capacity, and the mode is automate where consequence is low. This is efficiency, not advantage, unless leaders convert the hours into training, planning and readiness. That conversion is a command decision. Without it the gain is real but not military.</w:t>
+        <w:t>15.</w:t>
+        <w:tab/>
+      </w:r>
+      <w:r>
+        <w:rPr>
+          <w:rFonts w:cs="Calibri"/>
+          <w:b w:val="false"/>
+          <w:i w:val="false"/>
+        </w:rPr>
+        <w:t>Correspondence, reporting, returns, minutes, records and routine staff process will yield the largest and earliest gains in hours, and are the safest to automate. Per paragraph 6, this is efficiency, and becomes military advantage only where commanders deliberately convert the hours into training, planning and readiness.</w:t>
       </w:r>
     </w:p>
     <w:p>
@@ -838,16 +1237,16 @@
         <w:rPr>
           <w:rFonts w:cs="Calibri"/>
         </w:rPr>
-        <w:t>13.</w:t>
-        <w:tab/>
-      </w:r>
-      <w:r>
-        <w:rPr>
-          <w:rFonts w:cs="Calibri"/>
-          <w:b w:val="false"/>
-          <w:i w:val="false"/>
-        </w:rPr>
-        <w:t>Two areas are deliberately not prioritised. Autonomous targeting and weapons are not Army's to develop, are policy and coalition dependent, and are the subject of unresolved legal and ethical questions. Predictive logistics and personnel analytics are real opportunities constrained by data maturity and, for personnel, by bias and trust; they follow the data foundations rather than lead them.</w:t>
+        <w:t>16.</w:t>
+        <w:tab/>
+      </w:r>
+      <w:r>
+        <w:rPr>
+          <w:rFonts w:cs="Calibri"/>
+          <w:b w:val="false"/>
+          <w:i w:val="false"/>
+        </w:rPr>
+        <w:t>Two areas are deliberately not prioritised. Autonomous targeting and weapons are not Army's to develop, are policy and coalition dependent, and carry unresolved legal and ethical questions. Predictive logistics and personnel analytics are real opportunities constrained by data maturity and, for personnel, by bias and trust; they follow the data foundations rather than lead them.</w:t>
       </w:r>
     </w:p>
     <w:tbl>
@@ -1763,7 +2162,7 @@
           <w:color w:val="000000"/>
           <w:sz w:val="23"/>
         </w:rPr>
-        <w:t>3. What Should Remain Human</w:t>
+        <w:t>4. What Should Remain Human</w:t>
       </w:r>
     </w:p>
     <w:p>
@@ -1781,7 +2180,7 @@
         <w:rPr>
           <w:rFonts w:cs="Calibri"/>
         </w:rPr>
-        <w:t>14.</w:t>
+        <w:t>17.</w:t>
         <w:tab/>
       </w:r>
       <w:r>
@@ -1925,7 +2324,7 @@
           <w:b w:val="false"/>
           <w:i w:val="false"/>
         </w:rPr>
-        <w:t>The foundational soldier and staff skills that Army must retain as a capability in their own right, because on operations the tools will be degraded, denied or deceived.</w:t>
+        <w:t>The foundational soldier and staff skills Army must retain as a capability in their own right, because on operations the tools will be degraded, denied or deceived.</w:t>
       </w:r>
     </w:p>
     <w:p>
@@ -1943,16 +2342,16 @@
         <w:rPr>
           <w:rFonts w:cs="Calibri"/>
         </w:rPr>
-        <w:t>15.</w:t>
-        <w:tab/>
-      </w:r>
-      <w:r>
-        <w:rPr>
-          <w:rFonts w:cs="Calibri"/>
-          <w:b w:val="false"/>
-          <w:i w:val="false"/>
-        </w:rPr>
-        <w:t>A simple rule for autonomy follows.</w:t>
+        <w:t>18.</w:t>
+        <w:tab/>
+      </w:r>
+      <w:r>
+        <w:rPr>
+          <w:rFonts w:cs="Calibri"/>
+          <w:b w:val="false"/>
+          <w:i w:val="false"/>
+        </w:rPr>
+        <w:t>Step f of the framework is settled by a single test:</w:t>
       </w:r>
     </w:p>
     <w:p>
@@ -1971,7 +2370,7 @@
           <w:color w:val="FFFFFF"/>
           <w:sz w:val="18"/>
         </w:rPr>
-        <w:t>Consequence × Reversibility × Verifiability</w:t>
+        <w:t>Assurance increases with consequence, irreversibility and difficulty of verification</w:t>
       </w:r>
     </w:p>
     <w:p>
@@ -1989,16 +2388,16 @@
         <w:rPr>
           <w:rFonts w:cs="Calibri"/>
         </w:rPr>
-        <w:t>16.</w:t>
-        <w:tab/>
-      </w:r>
-      <w:r>
-        <w:rPr>
-          <w:rFonts w:cs="Calibri"/>
-          <w:b w:val="false"/>
-          <w:i w:val="false"/>
-        </w:rPr>
-        <w:t>Greater AI autonomy is acceptable where the consequence of error is low, the action can be reversed, and the accountable person can readily check the output. Greater human control and assurance are required where consequence is high, effects are irreversible, or the output cannot be verified. Where the tool may be unavailable on operations, the person retains the skill regardless. This rule is deliberately the same shape as the decision rule in the training approach. Leaders should reason the same way about both.</w:t>
+        <w:t>19.</w:t>
+        <w:tab/>
+      </w:r>
+      <w:r>
+        <w:rPr>
+          <w:rFonts w:cs="Calibri"/>
+          <w:b w:val="false"/>
+          <w:i w:val="false"/>
+        </w:rPr>
+        <w:t>Where error is cheap, reversible and easy to check, greater autonomy is acceptable. Where consequence is high, effects are irreversible, or output cannot readily be verified, greater control and assurance are required. This asks the same kind of question as the decision rule in the training approach: match the level of control to what is at stake.</w:t>
       </w:r>
     </w:p>
     <w:p>
@@ -2017,7 +2416,7 @@
           <w:color w:val="000000"/>
           <w:sz w:val="23"/>
         </w:rPr>
-        <w:t>4. What This Means for Army People</w:t>
+        <w:t>5. What This Means for Army People</w:t>
       </w:r>
     </w:p>
     <w:p>
@@ -2035,7 +2434,7 @@
         <w:rPr>
           <w:rFonts w:cs="Calibri"/>
         </w:rPr>
-        <w:t>17.</w:t>
+        <w:t>20.</w:t>
         <w:tab/>
       </w:r>
       <w:r>
@@ -2062,16 +2461,16 @@
         <w:rPr>
           <w:rFonts w:cs="Calibri"/>
         </w:rPr>
-        <w:t>18.</w:t>
-        <w:tab/>
-      </w:r>
-      <w:r>
-        <w:rPr>
-          <w:rFonts w:cs="Calibri"/>
-          <w:b w:val="false"/>
-          <w:i w:val="false"/>
-        </w:rPr>
-        <w:t>Four levels, cumulative:</w:t>
+        <w:t>21.</w:t>
+        <w:tab/>
+      </w:r>
+      <w:r>
+        <w:rPr>
+          <w:rFonts w:cs="Calibri"/>
+          <w:b w:val="false"/>
+          <w:i w:val="false"/>
+        </w:rPr>
+        <w:t>Four complementary requirements, not a ladder. Everyone understands it; many employ it; leaders govern it; a few specialise in it.</w:t>
       </w:r>
     </w:p>
     <w:p>
@@ -2098,15 +2497,15 @@
           <w:b/>
           <w:i w:val="false"/>
         </w:rPr>
-        <w:t>All ranks.</w:t>
-      </w:r>
-      <w:r>
-        <w:rPr>
-          <w:rFonts w:cs="Calibri"/>
-          <w:b w:val="false"/>
-          <w:i w:val="false"/>
-        </w:rPr>
-        <w:t xml:space="preserve"> Understand what these tools are, how they fail, what may and may not be put into them, and the obligation to verify before use.</w:t>
+        <w:t>All personnel.</w:t>
+      </w:r>
+      <w:r>
+        <w:rPr>
+          <w:rFonts w:cs="Calibri"/>
+          <w:b w:val="false"/>
+          <w:i w:val="false"/>
+        </w:rPr>
+        <w:t xml:space="preserve"> What these tools are, how they fail, what may and may not be put into them, and the obligation to verify before use.</w:t>
       </w:r>
     </w:p>
     <w:p>
@@ -2168,15 +2567,15 @@
           <w:b/>
           <w:i w:val="false"/>
         </w:rPr>
-        <w:t>Commanders and leaders.</w:t>
-      </w:r>
-      <w:r>
-        <w:rPr>
-          <w:rFonts w:cs="Calibri"/>
-          <w:b w:val="false"/>
-          <w:i w:val="false"/>
-        </w:rPr>
-        <w:t xml:space="preserve"> Set risk appetite by consequence; assure outputs; protect the underlying competence of their people; own accountability for AI-enabled products; understand what a system cannot tell them.</w:t>
+        <w:t>Leaders and commanders.</w:t>
+      </w:r>
+      <w:r>
+        <w:rPr>
+          <w:rFonts w:cs="Calibri"/>
+          <w:b w:val="false"/>
+          <w:i w:val="false"/>
+        </w:rPr>
+        <w:t xml:space="preserve"> Set risk appetite by consequence; assure outputs; protect their people's underlying competence; own accountability for AI-enabled products; understand what a system cannot tell them. A governance requirement, not a more advanced technical one.</w:t>
       </w:r>
     </w:p>
     <w:p>
@@ -2211,7 +2610,7 @@
           <w:b w:val="false"/>
           <w:i w:val="false"/>
         </w:rPr>
-        <w:t xml:space="preserve"> Data, security and model assurance, and the integration of approved tools into Army systems. Few, and shared across the NZDF.</w:t>
+        <w:t xml:space="preserve"> Data, security and model assurance, and integration of approved tools into Army systems. Few, and shared across the NZDF.</w:t>
       </w:r>
     </w:p>
     <w:p>
@@ -2229,16 +2628,16 @@
         <w:rPr>
           <w:rFonts w:cs="Calibri"/>
         </w:rPr>
-        <w:t>19.</w:t>
-        <w:tab/>
-      </w:r>
-      <w:r>
-        <w:rPr>
-          <w:rFonts w:cs="Calibri"/>
-          <w:b w:val="false"/>
-          <w:i w:val="false"/>
-        </w:rPr>
-        <w:t>Army's own experience is consistent on one point: confidence and competence come from practice against real tasks, not from exposure. Investment in tools without practised people has not produced productivity in the wider economy, and will not produce capability in Army.</w:t>
+        <w:t>22.</w:t>
+        <w:tab/>
+      </w:r>
+      <w:r>
+        <w:rPr>
+          <w:rFonts w:cs="Calibri"/>
+          <w:b w:val="false"/>
+          <w:i w:val="false"/>
+        </w:rPr>
+        <w:t>Confidence and competence come from practice against real tasks, not from exposure. Investment in tools without practised people has not produced productivity in the wider economy, and will not produce capability in Army.</w:t>
       </w:r>
     </w:p>
     <w:p>
@@ -2257,7 +2656,7 @@
           <w:color w:val="000000"/>
           <w:sz w:val="23"/>
         </w:rPr>
-        <w:t>5. What This Means for Individual Training</w:t>
+        <w:t>6. What This Means for Individual Training</w:t>
       </w:r>
     </w:p>
     <w:p>
@@ -2275,7 +2674,7 @@
         <w:rPr>
           <w:rFonts w:cs="Calibri"/>
         </w:rPr>
-        <w:t>20.</w:t>
+        <w:t>23.</w:t>
         <w:tab/>
       </w:r>
       <w:r>
@@ -2319,7 +2718,7 @@
           <w:b w:val="false"/>
           <w:i w:val="false"/>
         </w:rPr>
-        <w:t xml:space="preserve"> For many roles the standard now includes the competent, judged use of approved tools. For foundational and safety-critical skills the standard is unchanged and is assured without the tool. Where a skill must survive denial, it is assessed unaided.</w:t>
+        <w:t xml:space="preserve"> For many roles the standard now includes the competent, judged use of approved tools. For foundational and safety-critical skills it is unchanged, and assured without the tool.</w:t>
       </w:r>
     </w:p>
     <w:p>
@@ -2354,7 +2753,7 @@
           <w:b w:val="false"/>
           <w:i w:val="false"/>
         </w:rPr>
-        <w:t xml:space="preserve"> AI makes adaptive pathways practical. Learning data, individual practice and feedback at scale, and assessment support let schools vary the route without varying the standard. This is the largest single contribution AI can make to the training system.</w:t>
+        <w:t xml:space="preserve"> AI makes adaptive pathways practical at scale, through learning data, individual practice and feedback, and assessment support. On this analysis it may be the most significant contribution AI can make to the training system, and it is the one Army most fully controls.</w:t>
       </w:r>
     </w:p>
     <w:p>
@@ -2381,15 +2780,15 @@
           <w:b/>
           <w:i w:val="false"/>
         </w:rPr>
-        <w:t>Progression and the decision rule.</w:t>
-      </w:r>
-      <w:r>
-        <w:rPr>
-          <w:rFonts w:cs="Calibri"/>
-          <w:b w:val="false"/>
-          <w:i w:val="false"/>
-        </w:rPr>
-        <w:t xml:space="preserve"> Tools are introduced where they will be used, not at the foundation. Core skills are built without them; tools enter at guided and independent practice for the tasks that will employ them; performance under pressure is assessed with them and, where it matters, without them. The decision rule sets which.</w:t>
+        <w:t>Progression.</w:t>
+      </w:r>
+      <w:r>
+        <w:rPr>
+          <w:rFonts w:cs="Calibri"/>
+          <w:b w:val="false"/>
+          <w:i w:val="false"/>
+        </w:rPr>
+        <w:t xml:space="preserve"> Tools are introduced where they will be used, not at the foundation. Core skills are built without them; tools enter at guided and independent practice for the tasks that will employ them. Instructors must be competent with a tool before their students are, which makes instructor development the first investment.</w:t>
       </w:r>
     </w:p>
     <w:p>
@@ -2424,7 +2823,7 @@
           <w:b w:val="false"/>
           <w:i w:val="false"/>
         </w:rPr>
-        <w:t xml:space="preserve"> AI supports learning before, during and after the course: preparation, reinforcement, and rapid update of content when tactics change. It shortens the cycle from feedback to reinforcement and adaptation.</w:t>
+        <w:t xml:space="preserve"> AI supports learning before, during and after the course, and shortens the path from feedback to reinforcement when tactics change. Instructor effort shifts from transmitting knowledge to coaching, verifying and assuring.</w:t>
       </w:r>
     </w:p>
     <w:p>
@@ -2451,85 +2850,15 @@
           <w:b/>
           <w:i w:val="false"/>
         </w:rPr>
-        <w:t>The instructor.</w:t>
-      </w:r>
-      <w:r>
-        <w:rPr>
-          <w:rFonts w:cs="Calibri"/>
-          <w:b w:val="false"/>
-          <w:i w:val="false"/>
-        </w:rPr>
-        <w:t xml:space="preserve"> Instructors shift from transmitting knowledge to coaching, verifying and assuring. They must be competent with the tools before their students are, and they are the guard against dependency. Instructor development is the first investment.</w:t>
-      </w:r>
-    </w:p>
-    <w:p>
-      <w:pPr>
-        <w:pStyle w:val="Normal"/>
-        <w:tabs>
-          <w:tab w:val="clear" w:pos="720"/>
-          <w:tab w:val="left" w:pos="1020" w:leader="none"/>
-        </w:tabs>
-        <w:spacing w:before="0" w:after="100"/>
-        <w:ind w:hanging="510" w:left="1020"/>
-        <w:rPr/>
-      </w:pPr>
-      <w:r>
-        <w:rPr>
-          <w:rFonts w:cs="Calibri"/>
-        </w:rPr>
-        <w:t>f.</w:t>
-        <w:tab/>
-      </w:r>
-      <w:r>
-        <w:rPr>
-          <w:rFonts w:cs="Calibri"/>
-          <w:b/>
-          <w:i w:val="false"/>
-        </w:rPr>
-        <w:t>What remains human.</w:t>
-      </w:r>
-      <w:r>
-        <w:rPr>
-          <w:rFonts w:cs="Calibri"/>
-          <w:b w:val="false"/>
-          <w:i w:val="false"/>
-        </w:rPr>
-        <w:t xml:space="preserve"> Judgement under pressure, leadership, physical and field skills, the ethical decision, and the trust between people on which teams are built.</w:t>
-      </w:r>
-    </w:p>
-    <w:p>
-      <w:pPr>
-        <w:pStyle w:val="Normal"/>
-        <w:tabs>
-          <w:tab w:val="clear" w:pos="720"/>
-          <w:tab w:val="left" w:pos="1020" w:leader="none"/>
-        </w:tabs>
-        <w:spacing w:before="0" w:after="100"/>
-        <w:ind w:hanging="510" w:left="1020"/>
-        <w:rPr/>
-      </w:pPr>
-      <w:r>
-        <w:rPr>
-          <w:rFonts w:cs="Calibri"/>
-        </w:rPr>
-        <w:t>g.</w:t>
-        <w:tab/>
-      </w:r>
-      <w:r>
-        <w:rPr>
-          <w:rFonts w:cs="Calibri"/>
-          <w:b/>
-          <w:i w:val="false"/>
-        </w:rPr>
-        <w:t>Preventing dependency.</w:t>
-      </w:r>
-      <w:r>
-        <w:rPr>
-          <w:rFonts w:cs="Calibri"/>
-          <w:b w:val="false"/>
-          <w:i w:val="false"/>
-        </w:rPr>
-        <w:t xml:space="preserve"> Deliberate tool-denied training and assessment for foundational skills, with the same discipline Army applies to navigation without GPS. Dependency is prevented by design, not by prohibition.</w:t>
+        <w:t>What remains human, and preventing dependency.</w:t>
+      </w:r>
+      <w:r>
+        <w:rPr>
+          <w:rFonts w:cs="Calibri"/>
+          <w:b w:val="false"/>
+          <w:i w:val="false"/>
+        </w:rPr>
+        <w:t xml:space="preserve"> Judgement under pressure, leadership, field skills, the ethical decision, and the trust on which teams are built. Dependency is prevented by design rather than prohibition: foundational skills are practised and assessed tool-denied, with the discipline Army applies to navigation without GPS.</w:t>
       </w:r>
     </w:p>
     <w:p>
@@ -2548,7 +2877,7 @@
           <w:color w:val="000000"/>
           <w:sz w:val="23"/>
         </w:rPr>
-        <w:t>6. Key Risks and Constraints</w:t>
+        <w:t>7. Risks and Constraints</w:t>
       </w:r>
     </w:p>
     <w:p>
@@ -2566,16 +2895,16 @@
         <w:rPr>
           <w:rFonts w:cs="Calibri"/>
         </w:rPr>
-        <w:t>21.</w:t>
-        <w:tab/>
-      </w:r>
-      <w:r>
-        <w:rPr>
-          <w:rFonts w:cs="Calibri"/>
-          <w:b w:val="false"/>
-          <w:i w:val="false"/>
-        </w:rPr>
-        <w:t>The risks that matter most for Army, in order of consequence:</w:t>
+        <w:t>24.</w:t>
+        <w:tab/>
+      </w:r>
+      <w:r>
+        <w:rPr>
+          <w:rFonts w:cs="Calibri"/>
+          <w:b w:val="false"/>
+          <w:i w:val="false"/>
+        </w:rPr>
+        <w:t>The risks that matter most, in order of consequence:</w:t>
       </w:r>
     </w:p>
     <w:p>
@@ -2610,7 +2939,7 @@
           <w:b w:val="false"/>
           <w:i w:val="false"/>
         </w:rPr>
-        <w:t xml:space="preserve"> Fabricated facts, references and figures in products that read as authoritative. Mitigated by verification as a duty, and by never using unverified output where consequence is high.</w:t>
+        <w:t xml:space="preserve"> Fabricated facts, references and figures in products that read as authoritative. Mitigated by verification as a duty, never optional where consequence is high.</w:t>
       </w:r>
     </w:p>
     <w:p>
@@ -2680,7 +3009,7 @@
           <w:b w:val="false"/>
           <w:i w:val="false"/>
         </w:rPr>
-        <w:t xml:space="preserve"> Staff and soldiers who cannot perform the task unaided when the tool is denied. Mitigated through the training approach, not through policy alone.</w:t>
+        <w:t xml:space="preserve"> Staff and soldiers who cannot perform unaided when the tool is denied. Mitigated through training, not policy.</w:t>
       </w:r>
     </w:p>
     <w:p>
@@ -2785,7 +3114,7 @@
           <w:b w:val="false"/>
           <w:i w:val="false"/>
         </w:rPr>
-        <w:t xml:space="preserve"> Decisions made because the system said so. Mitigated by the autonomy rule and by command practice.</w:t>
+        <w:t xml:space="preserve"> Decisions made because the system said so.</w:t>
       </w:r>
     </w:p>
     <w:p>
@@ -2803,16 +3132,16 @@
         <w:rPr>
           <w:rFonts w:cs="Calibri"/>
         </w:rPr>
-        <w:t>22.</w:t>
-        <w:tab/>
-      </w:r>
-      <w:r>
-        <w:rPr>
-          <w:rFonts w:cs="Calibri"/>
-          <w:b w:val="false"/>
-          <w:i w:val="false"/>
-        </w:rPr>
-        <w:t>The constraints are institutional before they are technical. Army has basic tools on restricted networks; external resources are blocked; security approval is slow; data sits in legacy systems; no one clearly owns AI; procurement runs in years while the capability changes in weeks; the workforce has no spare capacity to experiment; and risk appetite defaults to no. Technical availability is not the barrier. Army's ability to exploit what is available is.</w:t>
+        <w:t>25.</w:t>
+        <w:tab/>
+      </w:r>
+      <w:r>
+        <w:rPr>
+          <w:rFonts w:cs="Calibri"/>
+          <w:b w:val="false"/>
+          <w:i w:val="false"/>
+        </w:rPr>
+        <w:t>The constraints appear institutional rather than technical: basic tools on restricted networks, external resources blocked, slow security approval, data in legacy systems, no clear ownership of AI, procurement measured in years against a capability that changes in weeks, no spare capacity to experiment, and a risk appetite that defaults to no. If that reading is right, Army's ability to exploit what is already available matters more than what becomes available next.</w:t>
       </w:r>
     </w:p>
     <w:p>
@@ -2831,7 +3160,7 @@
           <w:color w:val="000000"/>
           <w:sz w:val="23"/>
         </w:rPr>
-        <w:t>7. An Army Approach to Employing AI</w:t>
+        <w:t>8. Principles</w:t>
       </w:r>
     </w:p>
     <w:p>
@@ -2849,62 +3178,16 @@
         <w:rPr>
           <w:rFonts w:cs="Calibri"/>
         </w:rPr>
-        <w:t>23.</w:t>
-        <w:tab/>
-      </w:r>
-      <w:r>
-        <w:rPr>
-          <w:rFonts w:cs="Calibri"/>
-          <w:b w:val="false"/>
-          <w:i w:val="false"/>
-        </w:rPr>
-        <w:t>The following is proposed for assessing any AI application. It improves the starting model in two ways. It inserts the constraint on the task before any opportunity is considered, so that reasoning begins with what actually limits the output rather than with the tool. And it closes as a loop on measured effect, so that applications are scaled, adjusted or stopped on evidence.</w:t>
-      </w:r>
-    </w:p>
-    <w:p>
-      <w:pPr>
-        <w:pStyle w:val="Normal"/>
-        <w:shd w:val="clear" w:color="auto" w:fill="00261B"/>
-        <w:spacing w:before="80" w:after="100"/>
-        <w:jc w:val="center"/>
-        <w:rPr/>
-      </w:pPr>
-      <w:r>
-        <w:rPr>
-          <w:rFonts w:cs="Calibri"/>
-          <w:b/>
-          <w:i w:val="false"/>
-          <w:color w:val="FFFFFF"/>
-          <w:sz w:val="18"/>
-        </w:rPr>
-        <w:t>Output → Task → Constraint → AI Mechanism → Human Role → Consequence and Assurance → Competence and Practice → Effect</w:t>
-      </w:r>
-    </w:p>
-    <w:p>
-      <w:pPr>
-        <w:pStyle w:val="Normal"/>
-        <w:tabs>
-          <w:tab w:val="clear" w:pos="720"/>
-          <w:tab w:val="left" w:pos="510" w:leader="none"/>
-        </w:tabs>
-        <w:spacing w:before="0" w:after="100"/>
-        <w:ind w:hanging="510" w:left="510"/>
-        <w:rPr/>
-      </w:pPr>
-      <w:r>
-        <w:rPr>
-          <w:rFonts w:cs="Calibri"/>
-        </w:rPr>
-        <w:t>24.</w:t>
-        <w:tab/>
-      </w:r>
-      <w:r>
-        <w:rPr>
-          <w:rFonts w:cs="Calibri"/>
-          <w:b w:val="false"/>
-          <w:i w:val="false"/>
-        </w:rPr>
-        <w:t>In use:</w:t>
+        <w:t>26.</w:t>
+        <w:tab/>
+      </w:r>
+      <w:r>
+        <w:rPr>
+          <w:rFonts w:cs="Calibri"/>
+          <w:b w:val="false"/>
+          <w:i w:val="false"/>
+        </w:rPr>
+        <w:t>Five principles for responsible and effective employment:</w:t>
       </w:r>
     </w:p>
     <w:p>
@@ -2931,15 +3214,15 @@
           <w:b/>
           <w:i w:val="false"/>
         </w:rPr>
-        <w:t>Output.</w:t>
-      </w:r>
-      <w:r>
-        <w:rPr>
-          <w:rFonts w:cs="Calibri"/>
-          <w:b w:val="false"/>
-          <w:i w:val="false"/>
-        </w:rPr>
-        <w:t xml:space="preserve"> What must Army deliver, and to what standard?</w:t>
+        <w:t>Effect first.</w:t>
+      </w:r>
+      <w:r>
+        <w:rPr>
+          <w:rFonts w:cs="Calibri"/>
+          <w:b w:val="false"/>
+          <w:i w:val="false"/>
+        </w:rPr>
+        <w:t xml:space="preserve"> AI is adopted where it improves an Army output, and is measured against that output.</w:t>
       </w:r>
     </w:p>
     <w:p>
@@ -2966,15 +3249,15 @@
           <w:b/>
           <w:i w:val="false"/>
         </w:rPr>
-        <w:t>Task.</w:t>
-      </w:r>
-      <w:r>
-        <w:rPr>
-          <w:rFonts w:cs="Calibri"/>
-          <w:b w:val="false"/>
-          <w:i w:val="false"/>
-        </w:rPr>
-        <w:t xml:space="preserve"> Which task limits that output?</w:t>
+        <w:t>Task before tool.</w:t>
+      </w:r>
+      <w:r>
+        <w:rPr>
+          <w:rFonts w:cs="Calibri"/>
+          <w:b w:val="false"/>
+          <w:i w:val="false"/>
+        </w:rPr>
+        <w:t xml:space="preserve"> Reason from the output and its constraint to the application, never from the technology to a use for it.</w:t>
       </w:r>
     </w:p>
     <w:p>
@@ -3001,15 +3284,15 @@
           <w:b/>
           <w:i w:val="false"/>
         </w:rPr>
-        <w:t>Constraint.</w:t>
-      </w:r>
-      <w:r>
-        <w:rPr>
-          <w:rFonts w:cs="Calibri"/>
-          <w:b w:val="false"/>
-          <w:i w:val="false"/>
-        </w:rPr>
-        <w:t xml:space="preserve"> What limits the task: time, quality, scale, understanding or people?</w:t>
+        <w:t>The commander owns it.</w:t>
+      </w:r>
+      <w:r>
+        <w:rPr>
+          <w:rFonts w:cs="Calibri"/>
+          <w:b w:val="false"/>
+          <w:i w:val="false"/>
+        </w:rPr>
+        <w:t xml:space="preserve"> AI advises, drafts and analyses; where consequence is high it does not decide. Verify what you use. You own what you sign.</w:t>
       </w:r>
     </w:p>
     <w:p>
@@ -3036,15 +3319,15 @@
           <w:b/>
           <w:i w:val="false"/>
         </w:rPr>
-        <w:t>AI mechanism.</w:t>
-      </w:r>
-      <w:r>
-        <w:rPr>
-          <w:rFonts w:cs="Calibri"/>
-          <w:b w:val="false"/>
-          <w:i w:val="false"/>
-        </w:rPr>
-        <w:t xml:space="preserve"> Would AI relieve that constraint, and how? If the mechanism cannot be stated, stop.</w:t>
+        <w:t>Assurance by consequence.</w:t>
+      </w:r>
+      <w:r>
+        <w:rPr>
+          <w:rFonts w:cs="Calibri"/>
+          <w:b w:val="false"/>
+          <w:i w:val="false"/>
+        </w:rPr>
+        <w:t xml:space="preserve"> Control and verification increase with consequence, irreversibility and difficulty of verification.</w:t>
       </w:r>
     </w:p>
     <w:p>
@@ -3071,147 +3354,15 @@
           <w:b/>
           <w:i w:val="false"/>
         </w:rPr>
-        <w:t>Human role.</w:t>
-      </w:r>
-      <w:r>
-        <w:rPr>
-          <w:rFonts w:cs="Calibri"/>
-          <w:b w:val="false"/>
-          <w:i w:val="false"/>
-        </w:rPr>
-        <w:t xml:space="preserve"> Augment, automate or enable; and what stays with the person.</w:t>
-      </w:r>
-    </w:p>
-    <w:p>
-      <w:pPr>
-        <w:pStyle w:val="Normal"/>
-        <w:tabs>
-          <w:tab w:val="clear" w:pos="720"/>
-          <w:tab w:val="left" w:pos="1020" w:leader="none"/>
-        </w:tabs>
-        <w:spacing w:before="0" w:after="100"/>
-        <w:ind w:hanging="510" w:left="1020"/>
-        <w:rPr/>
-      </w:pPr>
-      <w:r>
-        <w:rPr>
-          <w:rFonts w:cs="Calibri"/>
-        </w:rPr>
-        <w:t>f.</w:t>
-        <w:tab/>
-      </w:r>
-      <w:r>
-        <w:rPr>
-          <w:rFonts w:cs="Calibri"/>
-          <w:b/>
-          <w:i w:val="false"/>
-        </w:rPr>
-        <w:t>Consequence and assurance.</w:t>
-      </w:r>
-      <w:r>
-        <w:rPr>
-          <w:rFonts w:cs="Calibri"/>
-          <w:b w:val="false"/>
-          <w:i w:val="false"/>
-        </w:rPr>
-        <w:t xml:space="preserve"> Apply Consequence × Reversibility × Verifiability. Set the control and verification required.</w:t>
-      </w:r>
-    </w:p>
-    <w:p>
-      <w:pPr>
-        <w:pStyle w:val="Normal"/>
-        <w:tabs>
-          <w:tab w:val="clear" w:pos="720"/>
-          <w:tab w:val="left" w:pos="1020" w:leader="none"/>
-        </w:tabs>
-        <w:spacing w:before="0" w:after="100"/>
-        <w:ind w:hanging="510" w:left="1020"/>
-        <w:rPr/>
-      </w:pPr>
-      <w:r>
-        <w:rPr>
-          <w:rFonts w:cs="Calibri"/>
-        </w:rPr>
-        <w:t>g.</w:t>
-        <w:tab/>
-      </w:r>
-      <w:r>
-        <w:rPr>
-          <w:rFonts w:cs="Calibri"/>
-          <w:b/>
-          <w:i w:val="false"/>
-        </w:rPr>
-        <w:t>Competence and practice.</w:t>
-      </w:r>
-      <w:r>
-        <w:rPr>
-          <w:rFonts w:cs="Calibri"/>
-          <w:b w:val="false"/>
-          <w:i w:val="false"/>
-        </w:rPr>
-        <w:t xml:space="preserve"> Who must be able to do what, and how will they practise it?</w:t>
-      </w:r>
-    </w:p>
-    <w:p>
-      <w:pPr>
-        <w:pStyle w:val="Normal"/>
-        <w:tabs>
-          <w:tab w:val="clear" w:pos="720"/>
-          <w:tab w:val="left" w:pos="1020" w:leader="none"/>
-        </w:tabs>
-        <w:spacing w:before="0" w:after="100"/>
-        <w:ind w:hanging="510" w:left="1020"/>
-        <w:rPr/>
-      </w:pPr>
-      <w:r>
-        <w:rPr>
-          <w:rFonts w:cs="Calibri"/>
-        </w:rPr>
-        <w:t>h.</w:t>
-        <w:tab/>
-      </w:r>
-      <w:r>
-        <w:rPr>
-          <w:rFonts w:cs="Calibri"/>
-          <w:b/>
-          <w:i w:val="false"/>
-        </w:rPr>
-        <w:t>Effect.</w:t>
-      </w:r>
-      <w:r>
-        <w:rPr>
-          <w:rFonts w:cs="Calibri"/>
-          <w:b w:val="false"/>
-          <w:i w:val="false"/>
-        </w:rPr>
-        <w:t xml:space="preserve"> Measure the effect on the output, not the use of the tool. Scale, adjust or stop.</w:t>
-      </w:r>
-    </w:p>
-    <w:p>
-      <w:pPr>
-        <w:pStyle w:val="Normal"/>
-        <w:tabs>
-          <w:tab w:val="clear" w:pos="720"/>
-          <w:tab w:val="left" w:pos="510" w:leader="none"/>
-        </w:tabs>
-        <w:spacing w:before="0" w:after="100"/>
-        <w:ind w:hanging="510" w:left="510"/>
-        <w:rPr/>
-      </w:pPr>
-      <w:r>
-        <w:rPr>
-          <w:rFonts w:cs="Calibri"/>
-        </w:rPr>
-        <w:t>25.</w:t>
-        <w:tab/>
-      </w:r>
-      <w:r>
-        <w:rPr>
-          <w:rFonts w:cs="Calibri"/>
-          <w:b w:val="false"/>
-          <w:i w:val="false"/>
-        </w:rPr>
-        <w:t>A commander, staff officer or training lead should be able to run this on a single page. An application that cannot survive steps c and d is novelty.</w:t>
+        <w:t>Competence before dependence.</w:t>
+      </w:r>
+      <w:r>
+        <w:rPr>
+          <w:rFonts w:cs="Calibri"/>
+          <w:b w:val="false"/>
+          <w:i w:val="false"/>
+        </w:rPr>
+        <w:t xml:space="preserve"> No one relies on a tool for a skill they must perform without it when it matters. Competence comes from practice against real tasks, and is measured like any other.</w:t>
       </w:r>
     </w:p>
     <w:p>
@@ -3230,7 +3381,7 @@
           <w:color w:val="000000"/>
           <w:sz w:val="23"/>
         </w:rPr>
-        <w:t>8. Principles</w:t>
+        <w:t>9. Priority Actions</w:t>
       </w:r>
     </w:p>
     <w:p>
@@ -3248,16 +3399,16 @@
         <w:rPr>
           <w:rFonts w:cs="Calibri"/>
         </w:rPr>
-        <w:t>26.</w:t>
-        <w:tab/>
-      </w:r>
-      <w:r>
-        <w:rPr>
-          <w:rFonts w:cs="Calibri"/>
-          <w:b w:val="false"/>
-          <w:i w:val="false"/>
-        </w:rPr>
-        <w:t>Seven principles for responsible and effective employment:</w:t>
+        <w:t>27.</w:t>
+        <w:tab/>
+      </w:r>
+      <w:r>
+        <w:rPr>
+          <w:rFonts w:cs="Calibri"/>
+          <w:b w:val="false"/>
+          <w:i w:val="false"/>
+        </w:rPr>
+        <w:t>Five actions, in order:</w:t>
       </w:r>
     </w:p>
     <w:p>
@@ -3284,15 +3435,15 @@
           <w:b/>
           <w:i w:val="false"/>
         </w:rPr>
-        <w:t>Effect is the test.</w:t>
-      </w:r>
-      <w:r>
-        <w:rPr>
-          <w:rFonts w:cs="Calibri"/>
-          <w:b w:val="false"/>
-          <w:i w:val="false"/>
-        </w:rPr>
-        <w:t xml:space="preserve"> AI is adopted where it improves an Army output, and is measured against that output.</w:t>
+        <w:t>Own it.</w:t>
+      </w:r>
+      <w:r>
+        <w:rPr>
+          <w:rFonts w:cs="Calibri"/>
+          <w:b w:val="false"/>
+          <w:i w:val="false"/>
+        </w:rPr>
+        <w:t xml:space="preserve"> Assign accountability for AI in Army and set a risk appetite by consequence, so that low-consequence use on approved tools is enabled by default rather than blocked by default.</w:t>
       </w:r>
     </w:p>
     <w:p>
@@ -3319,15 +3470,15 @@
           <w:b/>
           <w:i w:val="false"/>
         </w:rPr>
-        <w:t>Reason from the task to the tool,</w:t>
-      </w:r>
-      <w:r>
-        <w:rPr>
-          <w:rFonts w:cs="Calibri"/>
-          <w:b w:val="false"/>
-          <w:i w:val="false"/>
-        </w:rPr>
-        <w:t xml:space="preserve"> never the reverse.</w:t>
+        <w:t>Prove effect in three places.</w:t>
+      </w:r>
+      <w:r>
+        <w:rPr>
+          <w:rFonts w:cs="Calibri"/>
+          <w:b w:val="false"/>
+          <w:i w:val="false"/>
+        </w:rPr>
+        <w:t xml:space="preserve"> Bounded, measured trials: planning and orders production in a headquarters; training design and feedback in Army Training Group; and readiness data integration. Measure effect on the output. Stop what does not work.</w:t>
       </w:r>
     </w:p>
     <w:p>
@@ -3354,15 +3505,15 @@
           <w:b/>
           <w:i w:val="false"/>
         </w:rPr>
-        <w:t>The commander decides and owns.</w:t>
-      </w:r>
-      <w:r>
-        <w:rPr>
-          <w:rFonts w:cs="Calibri"/>
-          <w:b w:val="false"/>
-          <w:i w:val="false"/>
-        </w:rPr>
-        <w:t xml:space="preserve"> AI advises, drafts and analyses. Where consequence is high it does not decide, and accountability does not move.</w:t>
+        <w:t>Train it through the approach.</w:t>
+      </w:r>
+      <w:r>
+        <w:rPr>
+          <w:rFonts w:cs="Calibri"/>
+          <w:b w:val="false"/>
+          <w:i w:val="false"/>
+        </w:rPr>
+        <w:t xml:space="preserve"> AI competence built into individual training against real tasks, with verification and tool-denied assurance of core skills. Instructors first.</w:t>
       </w:r>
     </w:p>
     <w:p>
@@ -3389,15 +3540,15 @@
           <w:b/>
           <w:i w:val="false"/>
         </w:rPr>
-        <w:t>Autonomy proportionate to consequence,</w:t>
-      </w:r>
-      <w:r>
-        <w:rPr>
-          <w:rFonts w:cs="Calibri"/>
-          <w:b w:val="false"/>
-          <w:i w:val="false"/>
-        </w:rPr>
-        <w:t xml:space="preserve"> reversibility and verifiability.</w:t>
+        <w:t>Fix the data.</w:t>
+      </w:r>
+      <w:r>
+        <w:rPr>
+          <w:rFonts w:cs="Calibri"/>
+          <w:b w:val="false"/>
+          <w:i w:val="false"/>
+        </w:rPr>
+        <w:t xml:space="preserve"> Readiness and training data are the constraint on the highest-value application Army fully controls.</w:t>
       </w:r>
     </w:p>
     <w:p>
@@ -3424,77 +3575,15 @@
           <w:b/>
           <w:i w:val="false"/>
         </w:rPr>
-        <w:t>Competence before dependence.</w:t>
-      </w:r>
-      <w:r>
-        <w:rPr>
-          <w:rFonts w:cs="Calibri"/>
-          <w:b w:val="false"/>
-          <w:i w:val="false"/>
-        </w:rPr>
-        <w:t xml:space="preserve"> No one relies on a tool for a skill they must be able to perform without it when it matters.</w:t>
-      </w:r>
-    </w:p>
-    <w:p>
-      <w:pPr>
-        <w:pStyle w:val="Normal"/>
-        <w:tabs>
-          <w:tab w:val="clear" w:pos="720"/>
-          <w:tab w:val="left" w:pos="1020" w:leader="none"/>
-        </w:tabs>
-        <w:spacing w:before="0" w:after="100"/>
-        <w:ind w:hanging="510" w:left="1020"/>
-        <w:rPr/>
-      </w:pPr>
-      <w:r>
-        <w:rPr>
-          <w:rFonts w:cs="Calibri"/>
-        </w:rPr>
-        <w:t>f.</w:t>
-        <w:tab/>
-      </w:r>
-      <w:r>
-        <w:rPr>
-          <w:rFonts w:cs="Calibri"/>
-          <w:b/>
-          <w:i w:val="false"/>
-        </w:rPr>
-        <w:t>Verify what you use. You own what you sign.</w:t>
-      </w:r>
-    </w:p>
-    <w:p>
-      <w:pPr>
-        <w:pStyle w:val="Normal"/>
-        <w:tabs>
-          <w:tab w:val="clear" w:pos="720"/>
-          <w:tab w:val="left" w:pos="1020" w:leader="none"/>
-        </w:tabs>
-        <w:spacing w:before="0" w:after="100"/>
-        <w:ind w:hanging="510" w:left="1020"/>
-        <w:rPr/>
-      </w:pPr>
-      <w:r>
-        <w:rPr>
-          <w:rFonts w:cs="Calibri"/>
-        </w:rPr>
-        <w:t>g.</w:t>
-        <w:tab/>
-      </w:r>
-      <w:r>
-        <w:rPr>
-          <w:rFonts w:cs="Calibri"/>
-          <w:b/>
-          <w:i w:val="false"/>
-        </w:rPr>
-        <w:t>Practise, measure, adapt.</w:t>
-      </w:r>
-      <w:r>
-        <w:rPr>
-          <w:rFonts w:cs="Calibri"/>
-          <w:b w:val="false"/>
-          <w:i w:val="false"/>
-        </w:rPr>
-        <w:t xml:space="preserve"> The capability changes in weeks. Army's ability to exploit it is a practised skill, not a purchase.</w:t>
+        <w:t>Compress the lessons cycle.</w:t>
+      </w:r>
+      <w:r>
+        <w:rPr>
+          <w:rFonts w:cs="Calibri"/>
+          <w:b w:val="false"/>
+          <w:i w:val="false"/>
+        </w:rPr>
+        <w:t xml:space="preserve"> Move from observation to updated training and tactics at a pace the force can act on.</w:t>
       </w:r>
     </w:p>
     <w:p>
@@ -3513,7 +3602,7 @@
           <w:color w:val="000000"/>
           <w:sz w:val="23"/>
         </w:rPr>
-        <w:t>9. Priority Actions</w:t>
+        <w:t>10. Unresolved Questions</w:t>
       </w:r>
     </w:p>
     <w:p>
@@ -3531,16 +3620,16 @@
         <w:rPr>
           <w:rFonts w:cs="Calibri"/>
         </w:rPr>
-        <w:t>27.</w:t>
-        <w:tab/>
-      </w:r>
-      <w:r>
-        <w:rPr>
-          <w:rFonts w:cs="Calibri"/>
-          <w:b w:val="false"/>
-          <w:i w:val="false"/>
-        </w:rPr>
-        <w:t>Five actions, in order:</w:t>
+        <w:t>28.</w:t>
+        <w:tab/>
+      </w:r>
+      <w:r>
+        <w:rPr>
+          <w:rFonts w:cs="Calibri"/>
+          <w:b w:val="false"/>
+          <w:i w:val="false"/>
+        </w:rPr>
+        <w:t>The following remain open, and the analysis above should be read with them in mind:</w:t>
       </w:r>
     </w:p>
     <w:p>
@@ -3564,18 +3653,10 @@
       <w:r>
         <w:rPr>
           <w:rFonts w:cs="Calibri"/>
-          <w:b/>
-          <w:i w:val="false"/>
-        </w:rPr>
-        <w:t>Own it.</w:t>
-      </w:r>
-      <w:r>
-        <w:rPr>
-          <w:rFonts w:cs="Calibri"/>
-          <w:b w:val="false"/>
-          <w:i w:val="false"/>
-        </w:rPr>
-        <w:t xml:space="preserve"> Assign accountability for AI in Army and set a risk appetite by consequence tier, so that low-consequence use on approved tools is enabled by default rather than blocked by default.</w:t>
+          <w:b w:val="false"/>
+          <w:i w:val="false"/>
+        </w:rPr>
+        <w:t>Whether skilled human capacity is in fact Army's binding constraint, on which the priorities here depend.</w:t>
       </w:r>
     </w:p>
     <w:p>
@@ -3599,18 +3680,10 @@
       <w:r>
         <w:rPr>
           <w:rFonts w:cs="Calibri"/>
-          <w:b/>
-          <w:i w:val="false"/>
-        </w:rPr>
-        <w:t>Prove effect in three places.</w:t>
-      </w:r>
-      <w:r>
-        <w:rPr>
-          <w:rFonts w:cs="Calibri"/>
-          <w:b w:val="false"/>
-          <w:i w:val="false"/>
-        </w:rPr>
-        <w:t xml:space="preserve"> Bounded, measured trials: planning and orders production in a headquarters or school; training design, content adaptation and feedback in Army Training Group; and readiness data integration. Measure effect on the output. Stop what does not work.</w:t>
+          <w:b w:val="false"/>
+          <w:i w:val="false"/>
+        </w:rPr>
+        <w:t>Where Army's models and data may run, under whose sovereignty and classification, including on deployed and coalition networks.</w:t>
       </w:r>
     </w:p>
     <w:p>
@@ -3634,18 +3707,10 @@
       <w:r>
         <w:rPr>
           <w:rFonts w:cs="Calibri"/>
-          <w:b/>
-          <w:i w:val="false"/>
-        </w:rPr>
-        <w:t>Train it through the approach.</w:t>
-      </w:r>
-      <w:r>
-        <w:rPr>
-          <w:rFonts w:cs="Calibri"/>
-          <w:b w:val="false"/>
-          <w:i w:val="false"/>
-        </w:rPr>
-        <w:t xml:space="preserve"> Tiered AI competence built into individual training against real tasks, with verification and tool-denied assurance of core skills. Instructors first.</w:t>
+          <w:b w:val="false"/>
+          <w:i w:val="false"/>
+        </w:rPr>
+        <w:t>How operational effect, rather than tool use or hours saved, will be measured.</w:t>
       </w:r>
     </w:p>
     <w:p>
@@ -3669,18 +3734,10 @@
       <w:r>
         <w:rPr>
           <w:rFonts w:cs="Calibri"/>
-          <w:b/>
-          <w:i w:val="false"/>
-        </w:rPr>
-        <w:t>Fix the data.</w:t>
-      </w:r>
-      <w:r>
-        <w:rPr>
-          <w:rFonts w:cs="Calibri"/>
-          <w:b w:val="false"/>
-          <w:i w:val="false"/>
-        </w:rPr>
-        <w:t xml:space="preserve"> Readiness and training data are the constraint on the highest-value application Army fully controls.</w:t>
+          <w:b w:val="false"/>
+          <w:i w:val="false"/>
+        </w:rPr>
+        <w:t>New Zealand's policy position on AI in targeting and lethal decision, and its coalition obligations.</w:t>
       </w:r>
     </w:p>
     <w:p>
@@ -3704,64 +3761,10 @@
       <w:r>
         <w:rPr>
           <w:rFonts w:cs="Calibri"/>
-          <w:b/>
-          <w:i w:val="false"/>
-        </w:rPr>
-        <w:t>Compress the lessons cycle.</w:t>
-      </w:r>
-      <w:r>
-        <w:rPr>
-          <w:rFonts w:cs="Calibri"/>
-          <w:b w:val="false"/>
-          <w:i w:val="false"/>
-        </w:rPr>
-        <w:t xml:space="preserve"> Use AI to move from observation to updated training and tactics at a pace the force can act on, and hold the organisation to that pace.</w:t>
-      </w:r>
-    </w:p>
-    <w:p>
-      <w:pPr>
-        <w:pStyle w:val="Heading1"/>
-        <w:pBdr>
-          <w:top w:val="single" w:sz="12" w:space="6" w:color="000000"/>
-        </w:pBdr>
-        <w:rPr/>
-      </w:pPr>
-      <w:r>
-        <w:rPr>
-          <w:rFonts w:cs="Arial Black" w:ascii="Arial Black" w:hAnsi="Arial Black"/>
-          <w:b w:val="false"/>
-          <w:i w:val="false"/>
-          <w:color w:val="000000"/>
-          <w:sz w:val="23"/>
-        </w:rPr>
-        <w:t>10. Unresolved Questions</w:t>
-      </w:r>
-    </w:p>
-    <w:p>
-      <w:pPr>
-        <w:pStyle w:val="Normal"/>
-        <w:tabs>
-          <w:tab w:val="clear" w:pos="720"/>
-          <w:tab w:val="left" w:pos="510" w:leader="none"/>
-        </w:tabs>
-        <w:spacing w:before="0" w:after="100"/>
-        <w:ind w:hanging="510" w:left="510"/>
-        <w:rPr/>
-      </w:pPr>
-      <w:r>
-        <w:rPr>
-          <w:rFonts w:cs="Calibri"/>
-        </w:rPr>
-        <w:t>28.</w:t>
-        <w:tab/>
-      </w:r>
-      <w:r>
-        <w:rPr>
-          <w:rFonts w:cs="Calibri"/>
-          <w:b w:val="false"/>
-          <w:i w:val="false"/>
-        </w:rPr>
-        <w:t>The following remain open, and the analysis above should be read with them in mind:</w:t>
+          <w:b w:val="false"/>
+          <w:i w:val="false"/>
+        </w:rPr>
+        <w:t>How loss of underlying competence will be detected before it matters.</w:t>
       </w:r>
     </w:p>
     <w:p>
@@ -3779,115 +3782,7 @@
         <w:rPr>
           <w:rFonts w:cs="Calibri"/>
         </w:rPr>
-        <w:t>a.</w:t>
-        <w:tab/>
-      </w:r>
-      <w:r>
-        <w:rPr>
-          <w:rFonts w:cs="Calibri"/>
-          <w:b w:val="false"/>
-          <w:i w:val="false"/>
-        </w:rPr>
-        <w:t>Where Army's models and data may run, under whose sovereignty and classification, including on deployed and coalition networks.</w:t>
-      </w:r>
-    </w:p>
-    <w:p>
-      <w:pPr>
-        <w:pStyle w:val="Normal"/>
-        <w:tabs>
-          <w:tab w:val="clear" w:pos="720"/>
-          <w:tab w:val="left" w:pos="1020" w:leader="none"/>
-        </w:tabs>
-        <w:spacing w:before="0" w:after="100"/>
-        <w:ind w:hanging="510" w:left="1020"/>
-        <w:rPr/>
-      </w:pPr>
-      <w:r>
-        <w:rPr>
-          <w:rFonts w:cs="Calibri"/>
-        </w:rPr>
-        <w:t>b.</w:t>
-        <w:tab/>
-      </w:r>
-      <w:r>
-        <w:rPr>
-          <w:rFonts w:cs="Calibri"/>
-          <w:b w:val="false"/>
-          <w:i w:val="false"/>
-        </w:rPr>
-        <w:t>How operational effect, rather than tool use or hours saved, will be measured.</w:t>
-      </w:r>
-    </w:p>
-    <w:p>
-      <w:pPr>
-        <w:pStyle w:val="Normal"/>
-        <w:tabs>
-          <w:tab w:val="clear" w:pos="720"/>
-          <w:tab w:val="left" w:pos="1020" w:leader="none"/>
-        </w:tabs>
-        <w:spacing w:before="0" w:after="100"/>
-        <w:ind w:hanging="510" w:left="1020"/>
-        <w:rPr/>
-      </w:pPr>
-      <w:r>
-        <w:rPr>
-          <w:rFonts w:cs="Calibri"/>
-        </w:rPr>
-        <w:t>c.</w:t>
-        <w:tab/>
-      </w:r>
-      <w:r>
-        <w:rPr>
-          <w:rFonts w:cs="Calibri"/>
-          <w:b w:val="false"/>
-          <w:i w:val="false"/>
-        </w:rPr>
-        <w:t>New Zealand's policy position on AI in targeting and lethal decision, and its coalition obligations.</w:t>
-      </w:r>
-    </w:p>
-    <w:p>
-      <w:pPr>
-        <w:pStyle w:val="Normal"/>
-        <w:tabs>
-          <w:tab w:val="clear" w:pos="720"/>
-          <w:tab w:val="left" w:pos="1020" w:leader="none"/>
-        </w:tabs>
-        <w:spacing w:before="0" w:after="100"/>
-        <w:ind w:hanging="510" w:left="1020"/>
-        <w:rPr/>
-      </w:pPr>
-      <w:r>
-        <w:rPr>
-          <w:rFonts w:cs="Calibri"/>
-        </w:rPr>
-        <w:t>d.</w:t>
-        <w:tab/>
-      </w:r>
-      <w:r>
-        <w:rPr>
-          <w:rFonts w:cs="Calibri"/>
-          <w:b w:val="false"/>
-          <w:i w:val="false"/>
-        </w:rPr>
-        <w:t>How loss of underlying competence will be detected before it matters.</w:t>
-      </w:r>
-    </w:p>
-    <w:p>
-      <w:pPr>
-        <w:pStyle w:val="Normal"/>
-        <w:tabs>
-          <w:tab w:val="clear" w:pos="720"/>
-          <w:tab w:val="left" w:pos="1020" w:leader="none"/>
-        </w:tabs>
-        <w:spacing w:before="0" w:after="100"/>
-        <w:ind w:hanging="510" w:left="1020"/>
-        <w:rPr/>
-      </w:pPr>
-      <w:r>
-        <w:rPr>
-          <w:rFonts w:cs="Calibri"/>
-        </w:rPr>
-        <w:t>e.</w:t>
+        <w:t>f.</w:t>
         <w:tab/>
       </w:r>
       <w:r>
@@ -3897,33 +3792,6 @@
           <w:i w:val="false"/>
         </w:rPr>
         <w:t>Who does this work in an army of Army's size, and what it displaces.</w:t>
-      </w:r>
-    </w:p>
-    <w:p>
-      <w:pPr>
-        <w:pStyle w:val="Normal"/>
-        <w:tabs>
-          <w:tab w:val="clear" w:pos="720"/>
-          <w:tab w:val="left" w:pos="1020" w:leader="none"/>
-        </w:tabs>
-        <w:spacing w:before="0" w:after="100"/>
-        <w:ind w:hanging="510" w:left="1020"/>
-        <w:rPr/>
-      </w:pPr>
-      <w:r>
-        <w:rPr>
-          <w:rFonts w:cs="Calibri"/>
-        </w:rPr>
-        <w:t>f.</w:t>
-        <w:tab/>
-      </w:r>
-      <w:r>
-        <w:rPr>
-          <w:rFonts w:cs="Calibri"/>
-          <w:b w:val="false"/>
-          <w:i w:val="false"/>
-        </w:rPr>
-        <w:t>Whether procurement and security approval can move at the pace the capability changes.</w:t>
       </w:r>
     </w:p>
     <w:p>
@@ -4095,7 +3963,7 @@
         <w:sz w:val="17"/>
         <w:rFonts w:cs="Calibri"/>
       </w:rPr>
-      <w:t>6</w:t>
+      <w:t>5</w:t>
     </w:r>
     <w:r>
       <w:rPr>
@@ -4138,7 +4006,7 @@
         <w:sz w:val="17"/>
         <w:rFonts w:cs="Calibri"/>
       </w:rPr>
-      <w:t>6</w:t>
+      <w:t>5</w:t>
     </w:r>
     <w:r>
       <w:rPr>
@@ -4219,7 +4087,7 @@
         <w:sz w:val="17"/>
         <w:rFonts w:cs="Calibri"/>
       </w:rPr>
-      <w:t>6</w:t>
+      <w:t>5</w:t>
     </w:r>
     <w:r>
       <w:rPr>
@@ -4262,7 +4130,7 @@
         <w:sz w:val="17"/>
         <w:rFonts w:cs="Calibri"/>
       </w:rPr>
-      <w:t>6</w:t>
+      <w:t>5</w:t>
     </w:r>
     <w:r>
       <w:rPr>

</xml_diff>

<commit_message>
Final editing pass on the AI paper and poster
Broadens the answer from one constraint to a material constraint on military
output, with skilled human capacity named as the likely most important now;
softens Action 4 to a likelihood; trims the planning row of the areas table;
and compresses the poster's principle and action bodies as poster copy, so
the bottom half reads from a wall while the paper keeps its full wording.

Co-Authored-By: Claude Fable 5.1 <noreply@anthropic.com>
Claude-Session: https://claude.ai/code/session_014ebTbQdLKZmAdeXWfR1Dsj
</commit_message>
<xml_diff>
--- a/output/ai-army-operational-effectiveness.docx
+++ b/output/ai-army-operational-effectiveness.docx
@@ -462,7 +462,7 @@
           <w:b w:val="false"/>
           <w:i w:val="false"/>
         </w:rPr>
-        <w:t>It follows that AI increases operational effectiveness where it relieves that constraint in ways that convert into capability, and not otherwise.</w:t>
+        <w:t>It follows that AI increases operational effectiveness where it relieves a material constraint on military output in ways that convert into capability, and not otherwise. For a small army, skilled human capacity is likely the most important such constraint now.</w:t>
       </w:r>
     </w:p>
     <w:p>
@@ -484,7 +484,7 @@
           <w:color w:val="00261B"/>
           <w:sz w:val="20"/>
         </w:rPr>
-        <w:t>Army should use AI where it relieves the constraint on skilled human capacity in ways that convert into capability.</w:t>
+        <w:t>Army should use AI where it relieves a material constraint on military output in ways that convert into capability.</w:t>
       </w:r>
     </w:p>
     <w:p>
@@ -1481,7 +1481,7 @@
                 <w:i w:val="false"/>
                 <w:sz w:val="18"/>
               </w:rPr>
-              <w:t>Speed, breadth of options, staff time returned to judgement</w:t>
+              <w:t>Faster planning; broader options; staff time returned to judgement</w:t>
             </w:r>
           </w:p>
         </w:tc>
@@ -1565,7 +1565,7 @@
                 <w:i w:val="false"/>
                 <w:sz w:val="18"/>
               </w:rPr>
-              <w:t>Decides, accepts risk, verifies the product</w:t>
+              <w:t>Decides, accepts risk, verifies</w:t>
             </w:r>
           </w:p>
         </w:tc>
@@ -3540,15 +3540,15 @@
           <w:b/>
           <w:i w:val="false"/>
         </w:rPr>
-        <w:t>Fix the data.</w:t>
-      </w:r>
-      <w:r>
-        <w:rPr>
-          <w:rFonts w:cs="Calibri"/>
-          <w:b w:val="false"/>
-          <w:i w:val="false"/>
-        </w:rPr>
-        <w:t xml:space="preserve"> Readiness and training data are the constraint on the highest-value application Army fully controls.</w:t>
+        <w:t>Improve the data.</w:t>
+      </w:r>
+      <w:r>
+        <w:rPr>
+          <w:rFonts w:cs="Calibri"/>
+          <w:b w:val="false"/>
+          <w:i w:val="false"/>
+        </w:rPr>
+        <w:t xml:space="preserve"> Readiness and training data are likely to constrain some of the highest-value applications Army can control directly.</w:t>
       </w:r>
     </w:p>
     <w:p>

</xml_diff>

<commit_message>
Correct the AI paper against the Defence AI course session
Defence holds an approved enterprise Copilot cleared for restricted and
protected material, and DFY 6020 already directs approved tools, labelling and
review. Corrects the access description, names labelling as the accountability
mechanism, narrows the ownership gap to converting AI into advantage rather
than governing tools, and notes that a running course is not a competence
standard. Draft v0.2.

Co-Authored-By: Claude Opus 5 <noreply@anthropic.com>
Claude-Session: https://claude.ai/code/session_014ebTbQdLKZmAdeXWfR1Dsj
</commit_message>
<xml_diff>
--- a/output/ai-army-operational-effectiveness.docx
+++ b/output/ai-army-operational-effectiveness.docx
@@ -174,7 +174,7 @@
           <w:i w:val="false"/>
           <w:sz w:val="18"/>
         </w:rPr>
-        <w:t>Draft v0.1</w:t>
+        <w:t>Draft v0.2</w:t>
       </w:r>
     </w:p>
     <w:p>
@@ -362,7 +362,7 @@
           <w:b w:val="false"/>
           <w:i w:val="false"/>
         </w:rPr>
-        <w:t>AI is new within the NZDF. Access is limited to basic tools on constrained networks, and the evidence for military effect is thin and drawn largely from larger armies with different problems. Several of the propositions below are working judgements reasoned from Army's situation rather than findings, and are marked as such. They are offered to be tested, not accepted.</w:t>
+        <w:t>AI is new within the NZDF, but it is not ungoverned. Defence holds a closed enterprise instance of Copilot approved for restricted and protected material, and DFY 6020 directs the use of approved tools only, with responsibilities for labelling and review. The evidence for military effect nonetheless remains thin, and is drawn largely from larger armies with different problems. Several propositions below are working judgements reasoned from Army's situation rather than findings, and are marked as such. They are offered to be tested, not accepted.</w:t>
       </w:r>
     </w:p>
     <w:p>
@@ -1090,7 +1090,7 @@
           <w:b w:val="false"/>
           <w:i w:val="false"/>
         </w:rPr>
-        <w:t>A small intelligence cell cannot process the open-source, coalition and sensor information available to it. AI can fuse, summarise, translate and flag change across volumes a person cannot read. Much of that opportunity is enabled by allies; Army's advantage lies in competent consumption and contribution, not in building the system. Separately, Army's readiness data on people, training, equipment and health sits in disconnected systems, and commanders see it late and in part. Army cannot currently see itself whole at all, and the constraint on doing so is data quality rather than technology.</w:t>
+        <w:t>A small intelligence cell cannot process the open-source, coalition and sensor information available to it. AI can fuse, summarise, translate and flag change across volumes a person cannot read. Much of that opportunity is enabled by allies; Army's advantage lies in competent consumption, not in building the system. Separately, readiness data on people, training, equipment and health sits in disconnected systems, seen late and in part. Army cannot currently see itself whole, and the constraint is data quality rather than technology.</w:t>
       </w:r>
     </w:p>
     <w:p>
@@ -1133,7 +1133,7 @@
           <w:b w:val="false"/>
           <w:i w:val="false"/>
         </w:rPr>
-        <w:t>Training design, content maintenance, scenario and simulation generation, individual practice, feedback and assessment support are the heart of force generation, and the point where the training approach and AI meet. AI can make adaptive pathways practical at scale, keep content current as tactics and equipment change, and shift instructor effort from transmission to coaching. The gain is readiness, through faster and more adaptive generation of competence. Section 6 develops this.</w:t>
+        <w:t>Training design, content maintenance, scenario generation, individual practice, feedback and assessment support are the heart of force generation, and where the training approach and AI meet. AI can make adaptive pathways practical at scale, keep content current as tactics and equipment change, and shift instructor effort from transmission to coaching. The gain is readiness, through faster and more adaptive generation of competence. Section 6 develops this.</w:t>
       </w:r>
     </w:p>
     <w:p>
@@ -1176,7 +1176,7 @@
           <w:b w:val="false"/>
           <w:i w:val="false"/>
         </w:rPr>
-        <w:t>Army's lessons cycle runs on documents and committees. The working judgement here is that it is slower than the tempo at which threats, tactics and equipment now change; Army should test this against its actual cycle times before acting on it. If it holds, AI can compress the path from observation and after-action review to updated training content and doctrine. Institutional learning speed matters for a small army because it cannot afford to relearn. The uncertainty is whether the organisation will act at the speed the tool allows.</w:t>
+        <w:t>Army's lessons cycle runs on documents and committees. The working judgement here is that it is slower than the tempo at which threats, tactics and equipment now change; Army should test that against its actual cycle times. If it holds, AI can compress the path from observation and after-action review to updated training and doctrine. Institutional learning speed matters for a small army because it cannot afford to relearn. The uncertainty is whether the organisation will act at the speed the tool allows.</w:t>
       </w:r>
     </w:p>
     <w:p>
@@ -1219,7 +1219,7 @@
           <w:b w:val="false"/>
           <w:i w:val="false"/>
         </w:rPr>
-        <w:t>Correspondence, reporting, returns, minutes, records and routine staff process will yield the largest and earliest gains in hours, and are the safest to automate. Per paragraph 6, this is efficiency, and becomes military advantage only where commanders deliberately convert the hours into training, planning and readiness.</w:t>
+        <w:t>Correspondence, reporting, returns, minutes and routine staff process will yield the largest and earliest gains in hours, and are the safest to automate. Per paragraph 6, this is efficiency, and becomes advantage only where commanders convert the hours into training, planning and readiness.</w:t>
       </w:r>
     </w:p>
     <w:p>
@@ -1246,7 +1246,7 @@
           <w:b w:val="false"/>
           <w:i w:val="false"/>
         </w:rPr>
-        <w:t>Two areas are deliberately not prioritised. Autonomous targeting and weapons are not Army's to develop, are policy and coalition dependent, and carry unresolved legal and ethical questions. Predictive logistics and personnel analytics are real opportunities constrained by data maturity and, for personnel, by bias and trust; they follow the data foundations rather than lead them.</w:t>
+        <w:t>Two areas are deliberately not prioritised. Autonomous targeting and weapons are not Army's to develop, and carry unresolved legal and ethical questions. Predictive logistics and personnel analytics are constrained by data maturity and, for personnel, by bias and trust; they follow the data foundations rather than lead them.</w:t>
       </w:r>
     </w:p>
     <w:tbl>
@@ -2297,7 +2297,7 @@
           <w:b w:val="false"/>
           <w:i w:val="false"/>
         </w:rPr>
-        <w:t>Accountability. A commander who signs a product owns it. The tool that drafted it does not.</w:t>
+        <w:t>Accountability. A commander who signs a product owns it; the tool that drafted it does not. AI-assisted output is official information, and is labelled and reviewed as DFY 6020 requires.</w:t>
       </w:r>
     </w:p>
     <w:p>
@@ -2397,7 +2397,7 @@
           <w:b w:val="false"/>
           <w:i w:val="false"/>
         </w:rPr>
-        <w:t>Where error is cheap, reversible and easy to check, greater autonomy is acceptable. Where consequence is high, effects are irreversible, or output cannot readily be verified, greater control and assurance are required. This asks the same kind of question as the decision rule in the training approach: match the level of control to what is at stake.</w:t>
+        <w:t>Where error is cheap, reversible and easy to check, greater autonomy is acceptable. Where consequence is high, effects are irreversible, or output cannot readily be verified, greater control and assurance are required. This asks the same question as the decision rule in the training approach: match control to what is at stake.</w:t>
       </w:r>
     </w:p>
     <w:p>
@@ -2753,7 +2753,7 @@
           <w:b w:val="false"/>
           <w:i w:val="false"/>
         </w:rPr>
-        <w:t xml:space="preserve"> AI makes adaptive pathways practical at scale, through learning data, individual practice and feedback, and assessment support. On this analysis it may be the most significant contribution AI can make to the training system, and it is the one Army most fully controls.</w:t>
+        <w:t xml:space="preserve"> AI makes adaptive pathways practical at scale, through learning data, individual practice and feedback. On this analysis it may be the most significant contribution AI can make to the training system, and the one Army most fully controls.</w:t>
       </w:r>
     </w:p>
     <w:p>
@@ -2974,7 +2974,7 @@
           <w:b w:val="false"/>
           <w:i w:val="false"/>
         </w:rPr>
-        <w:t xml:space="preserve"> Sensitive information entering tools not approved for it; sovereignty over where models run; allied caveats. The constraint that most limits early use, and rightly.</w:t>
+        <w:t xml:space="preserve"> Sensitive information entering tools not approved for it; sovereignty over where models run; allied caveats. DFY 6020 addresses the first by directing approved tools only. The others remain open, and rightly limit early use.</w:t>
       </w:r>
     </w:p>
     <w:p>
@@ -3141,7 +3141,7 @@
           <w:b w:val="false"/>
           <w:i w:val="false"/>
         </w:rPr>
-        <w:t>The constraints appear institutional rather than technical: basic tools on restricted networks, external resources blocked, slow security approval, data in legacy systems, no clear ownership of AI, procurement measured in years against a capability that changes in weeks, no spare capacity to experiment, and a risk appetite that defaults to no. If that reading is right, Army's ability to exploit what is already available matters more than what becomes available next.</w:t>
+        <w:t>The constraints appear institutional rather than technical: external resources blocked, slow security approval, data in legacy systems, no single owner accountable for converting AI into military advantage, procurement measured in years against a capability that changes in weeks, no spare capacity to experiment, and a risk appetite that defaults to no. An approved enterprise tool is already in place; if this reading is right, Army's ability to exploit what it has matters more than what becomes available next.</w:t>
       </w:r>
     </w:p>
     <w:p>
@@ -3513,7 +3513,7 @@
           <w:b w:val="false"/>
           <w:i w:val="false"/>
         </w:rPr>
-        <w:t xml:space="preserve"> AI competence built into individual training against real tasks, with verification and tool-denied assurance of core skills. Instructors first.</w:t>
+        <w:t xml:space="preserve"> A Defence AI course is running; the step now is to build that competence into individual training against real Army tasks, with verification and tool-denied assurance of core skills. Instructors first.</w:t>
       </w:r>
     </w:p>
     <w:p>
@@ -3818,7 +3818,7 @@
           <w:b w:val="false"/>
           <w:i w:val="false"/>
         </w:rPr>
-        <w:t>What the AI competence standard is, by rank and trade, and who sets it.</w:t>
+        <w:t>What the AI competence standard is, by rank and trade, and who sets it. A Defence course is running; a course is not a standard.</w:t>
       </w:r>
     </w:p>
     <w:p>
@@ -3843,6 +3843,7 @@
     <w:p>
       <w:pPr>
         <w:pStyle w:val="Normal"/>
+        <w:keepLines/>
         <w:pBdr>
           <w:left w:val="single" w:sz="28" w:space="8" w:color="D31145"/>
         </w:pBdr>
@@ -3933,7 +3934,7 @@
       </w:rPr>
       <w:t>AI and Army Operational Effectiveness</w:t>
       <w:tab/>
-      <w:t>Draft v0.1</w:t>
+      <w:t>Draft v0.2</w:t>
       <w:tab/>
       <w:t xml:space="preserve">Page </w:t>
     </w:r>
@@ -4057,7 +4058,7 @@
       </w:rPr>
       <w:t>AI and Army Operational Effectiveness</w:t>
       <w:tab/>
-      <w:t>Draft v0.1</w:t>
+      <w:t>Draft v0.2</w:t>
       <w:tab/>
       <w:t xml:space="preserve">Page </w:t>
     </w:r>
@@ -4364,14 +4365,14 @@
     <w:pPr>
       <w:widowControl/>
       <w:bidi w:val="0"/>
-      <w:spacing w:lineRule="auto" w:line="259" w:before="0" w:after="100"/>
+      <w:spacing w:lineRule="auto" w:line="259" w:before="0" w:after="90"/>
       <w:jc w:val="left"/>
     </w:pPr>
     <w:rPr>
       <w:rFonts w:ascii="Calibri" w:hAnsi="Calibri" w:cs="Calibri" w:eastAsia="WenQuanYi Zen Hei"/>
       <w:color w:val="000000"/>
       <w:kern w:val="0"/>
-      <w:sz w:val="20"/>
+      <w:sz w:val="19"/>
       <w:szCs w:val="22"/>
       <w:lang w:val="en-US" w:eastAsia="en-US" w:bidi="ar-SA"/>
     </w:rPr>
@@ -4386,7 +4387,7 @@
     <w:pPr>
       <w:keepNext w:val="true"/>
       <w:keepLines/>
-      <w:spacing w:before="220" w:after="100"/>
+      <w:spacing w:before="180" w:after="100"/>
       <w:outlineLvl w:val="0"/>
     </w:pPr>
     <w:rPr>
@@ -4407,7 +4408,7 @@
     <w:pPr>
       <w:keepNext w:val="true"/>
       <w:keepLines/>
-      <w:spacing w:before="160" w:after="60"/>
+      <w:spacing w:before="140" w:after="60"/>
       <w:outlineLvl w:val="1"/>
     </w:pPr>
     <w:rPr>

</xml_diff>

<commit_message>
Plain-English pass on the AI poster and paper
Simplifies expression, not thinking. Answer, framework labels and assurance
rule rewritten in plain terms and kept identical across both products: AI
Mechanism becomes AI, Consequence and Assurance becomes Assurance, and the
assurance rule now reads as a commander would say it, with its three tests
beneath. Tiles say what improves and who stays responsible. Removes the
strapline that repeated the question and the test line that repeated the
first principle.

Co-Authored-By: Claude Opus 5 <noreply@anthropic.com>
Claude-Session: https://claude.ai/code/session_014ebTbQdLKZmAdeXWfR1Dsj
</commit_message>
<xml_diff>
--- a/output/ai-army-operational-effectiveness.docx
+++ b/output/ai-army-operational-effectiveness.docx
@@ -462,7 +462,7 @@
           <w:b w:val="false"/>
           <w:i w:val="false"/>
         </w:rPr>
-        <w:t>It follows that AI increases operational effectiveness where it relieves a material constraint on military output in ways that convert into capability, and not otherwise. For a small army, skilled human capacity is likely the most important such constraint now.</w:t>
+        <w:t>It follows that AI increases operational effectiveness only where it relieves something genuinely limiting an Army output. For a small army, skilled human capacity is likely the most important such limit now.</w:t>
       </w:r>
     </w:p>
     <w:p>
@@ -484,7 +484,7 @@
           <w:color w:val="00261B"/>
           <w:sz w:val="20"/>
         </w:rPr>
-        <w:t>Army should use AI where it relieves a material constraint on military output in ways that convert into capability.</w:t>
+        <w:t>Use AI where it removes a real limit on what Army can do, and where that makes Army more capable.</w:t>
       </w:r>
     </w:p>
     <w:p>
@@ -624,7 +624,7 @@
           <w:color w:val="FFFFFF"/>
           <w:sz w:val="18"/>
         </w:rPr>
-        <w:t>Output → Task → Constraint → AI Mechanism → Human Role → Consequence and Assurance → Competence and Practice → Effect</w:t>
+        <w:t>Output → Task → Constraint → AI → Human Role → Assurance → Competence → Effect</w:t>
       </w:r>
     </w:p>
     <w:p>
@@ -783,15 +783,15 @@
           <w:b/>
           <w:i w:val="false"/>
         </w:rPr>
-        <w:t>AI mechanism.</w:t>
-      </w:r>
-      <w:r>
-        <w:rPr>
-          <w:rFonts w:cs="Calibri"/>
-          <w:b w:val="false"/>
-          <w:i w:val="false"/>
-        </w:rPr>
-        <w:t xml:space="preserve"> Would AI relieve that constraint, and how? If the mechanism cannot be stated plainly, stop.</w:t>
+        <w:t>AI.</w:t>
+      </w:r>
+      <w:r>
+        <w:rPr>
+          <w:rFonts w:cs="Calibri"/>
+          <w:b w:val="false"/>
+          <w:i w:val="false"/>
+        </w:rPr>
+        <w:t xml:space="preserve"> Would AI relieve that constraint, and how? If you cannot say how, stop.</w:t>
       </w:r>
     </w:p>
     <w:p>
@@ -853,15 +853,15 @@
           <w:b/>
           <w:i w:val="false"/>
         </w:rPr>
-        <w:t>Consequence and assurance.</w:t>
-      </w:r>
-      <w:r>
-        <w:rPr>
-          <w:rFonts w:cs="Calibri"/>
-          <w:b w:val="false"/>
-          <w:i w:val="false"/>
-        </w:rPr>
-        <w:t xml:space="preserve"> What does the consequence of error require by way of control and verification?</w:t>
+        <w:t>Assurance.</w:t>
+      </w:r>
+      <w:r>
+        <w:rPr>
+          <w:rFonts w:cs="Calibri"/>
+          <w:b w:val="false"/>
+          <w:i w:val="false"/>
+        </w:rPr>
+        <w:t xml:space="preserve"> What does the consequence of error require by way of control and checking?</w:t>
       </w:r>
     </w:p>
     <w:p>
@@ -888,7 +888,7 @@
           <w:b/>
           <w:i w:val="false"/>
         </w:rPr>
-        <w:t>Competence and practice.</w:t>
+        <w:t>Competence.</w:t>
       </w:r>
       <w:r>
         <w:rPr>
@@ -958,7 +958,7 @@
           <w:b w:val="false"/>
           <w:i w:val="false"/>
         </w:rPr>
-        <w:t>A commander, staff officer or training lead should run this on a single page. An application that cannot answer steps c and d is novelty. The sections that follow apply it.</w:t>
+        <w:t>A commander, staff officer or training lead should run this on a single page. If you cannot say what is limiting the task, and how AI would help, stop. The sections that follow apply it.</w:t>
       </w:r>
     </w:p>
     <w:p>
@@ -2370,7 +2370,7 @@
           <w:color w:val="FFFFFF"/>
           <w:sz w:val="18"/>
         </w:rPr>
-        <w:t>Assurance increases with consequence, irreversibility and difficulty of verification</w:t>
+        <w:t>The more it matters if AI gets it wrong, the more human control and checking is required</w:t>
       </w:r>
     </w:p>
     <w:p>
@@ -3327,7 +3327,7 @@
           <w:b w:val="false"/>
           <w:i w:val="false"/>
         </w:rPr>
-        <w:t xml:space="preserve"> Control and verification increase with consequence, irreversibility and difficulty of verification.</w:t>
+        <w:t xml:space="preserve"> More human control where getting it wrong matters more.</w:t>
       </w:r>
     </w:p>
     <w:p>
@@ -3362,7 +3362,7 @@
           <w:b w:val="false"/>
           <w:i w:val="false"/>
         </w:rPr>
-        <w:t xml:space="preserve"> No one relies on a tool for a skill they must perform without it when it matters. Competence comes from practice against real tasks, and is measured like any other.</w:t>
+        <w:t xml:space="preserve"> Never depend on AI for a skill Army must be able to perform without it. Competence comes from practice against real tasks, and is measured like any other.</w:t>
       </w:r>
     </w:p>
     <w:p>

</xml_diff>

<commit_message>
Correct the AI overclaims and add a falsification pack
Renames the advantage row to priority areas to test and states in the paper
that none has been measured inside Army; softens the data claim to a
hypothesis to test; and names what makes AI different from any other
technology, since the framework alone would suit most of them.

Adds Testing the Approach: a two-page pack putting both models to the units
and staff branches best placed to break them, with the version under test
stated and returns asked for as failures rather than agreement.

Co-Authored-By: Claude Opus 5 <noreply@anthropic.com>
Claude-Session: https://claude.ai/code/session_014ebTbQdLKZmAdeXWfR1Dsj
</commit_message>
<xml_diff>
--- a/output/ai-army-operational-effectiveness.docx
+++ b/output/ai-army-operational-effectiveness.docx
@@ -1004,7 +1004,7 @@
           <w:b w:val="false"/>
           <w:i w:val="false"/>
         </w:rPr>
-        <w:t>Five areas survive the test, ordered by the strength of the mechanism and by how much of the opportunity Army itself controls.</w:t>
+        <w:t>Five areas survive the test, ordered by the strength of the mechanism and by how much of the opportunity Army itself controls. None has been measured inside Army: these are the areas to trial first, not demonstrated findings.</w:t>
       </w:r>
     </w:p>
     <w:p>
@@ -3548,7 +3548,7 @@
           <w:b w:val="false"/>
           <w:i w:val="false"/>
         </w:rPr>
-        <w:t xml:space="preserve"> Readiness and training data are likely to constrain some of the highest-value applications Army can control directly.</w:t>
+        <w:t xml:space="preserve"> Readiness and training data may constrain some of the highest-value applications Army can control directly. Test that before investing in it.</w:t>
       </w:r>
     </w:p>
     <w:p>

</xml_diff>